<commit_message>
Some updates of reports
</commit_message>
<xml_diff>
--- a/ProjectReports/25-26 Final Progress Review Template.docx
+++ b/ProjectReports/25-26 Final Progress Review Template.docx
@@ -12,6 +12,7 @@
           <w:color w:val="000000" w:themeColor="text1"/>
           <w:sz w:val="40"/>
           <w:szCs w:val="40"/>
+          <w:lang w:val="en-US"/>
         </w:rPr>
       </w:pPr>
       <w:bookmarkStart w:id="0" w:name="_Toc209044157"/>
@@ -278,14 +279,15 @@
       </w:pPr>
       <w:r>
         <w:rPr>
-          <w:rFonts w:ascii="Arial" w:hAnsi="Arial" w:cs="Arial"/>
+          <w:rFonts w:ascii="Arial" w:hAnsi="Arial" w:cs="Arial" w:hint="eastAsia"/>
           <w:b/>
           <w:bCs/>
           <w:color w:val="000000" w:themeColor="text1"/>
           <w:sz w:val="40"/>
           <w:szCs w:val="40"/>
-        </w:rPr>
-        <w:t>[Project Title Here]</w:t>
+          <w:lang w:eastAsia="zh-CN"/>
+        </w:rPr>
+        <w:t>The project for learning Chinese and other languages</w:t>
       </w:r>
     </w:p>
     <w:p>
@@ -436,7 +438,7 @@
     <w:p>
       <w:pPr>
         <w:rPr>
-          <w:rFonts w:ascii="Arial" w:hAnsi="Arial" w:cs="Arial" w:hint="eastAsia"/>
+          <w:rFonts w:ascii="Arial" w:hAnsi="Arial" w:cs="Arial"/>
           <w:sz w:val="32"/>
           <w:szCs w:val="32"/>
           <w:lang w:eastAsia="zh-CN"/>
@@ -473,7 +475,7 @@
     <w:p>
       <w:pPr>
         <w:rPr>
-          <w:rFonts w:ascii="Arial" w:hAnsi="Arial" w:cs="Arial" w:hint="eastAsia"/>
+          <w:rFonts w:ascii="Arial" w:hAnsi="Arial" w:cs="Arial"/>
           <w:sz w:val="32"/>
           <w:szCs w:val="32"/>
           <w:lang w:eastAsia="zh-CN"/>
@@ -510,7 +512,7 @@
     <w:p>
       <w:pPr>
         <w:rPr>
-          <w:rFonts w:ascii="Arial" w:hAnsi="Arial" w:cs="Arial" w:hint="eastAsia"/>
+          <w:rFonts w:ascii="Arial" w:hAnsi="Arial" w:cs="Arial"/>
           <w:sz w:val="32"/>
           <w:szCs w:val="32"/>
           <w:lang w:eastAsia="zh-CN"/>
@@ -534,7 +536,6 @@
         </w:rPr>
         <w:t xml:space="preserve"> </w:t>
       </w:r>
-      <w:proofErr w:type="gramStart"/>
       <w:r>
         <w:rPr>
           <w:rFonts w:ascii="Arial" w:hAnsi="Arial" w:cs="Arial" w:hint="eastAsia"/>
@@ -542,9 +543,8 @@
           <w:szCs w:val="32"/>
           <w:lang w:eastAsia="zh-CN"/>
         </w:rPr>
-        <w:t>BSc(</w:t>
-      </w:r>
-      <w:proofErr w:type="gramEnd"/>
+        <w:t>BSc(Hon</w:t>
+      </w:r>
       <w:r>
         <w:rPr>
           <w:rFonts w:ascii="Arial" w:hAnsi="Arial" w:cs="Arial" w:hint="eastAsia"/>
@@ -552,13 +552,22 @@
           <w:szCs w:val="32"/>
           <w:lang w:eastAsia="zh-CN"/>
         </w:rPr>
-        <w:t>Hon) Computer gaming technology</w:t>
-      </w:r>
-    </w:p>
-    <w:p>
-      <w:pPr>
+        <w:t>s</w:t>
+      </w:r>
+      <w:r>
         <w:rPr>
           <w:rFonts w:ascii="Arial" w:hAnsi="Arial" w:cs="Arial" w:hint="eastAsia"/>
+          <w:sz w:val="32"/>
+          <w:szCs w:val="32"/>
+          <w:lang w:eastAsia="zh-CN"/>
+        </w:rPr>
+        <w:t>) Computer gaming technology</w:t>
+      </w:r>
+    </w:p>
+    <w:p>
+      <w:pPr>
+        <w:rPr>
+          <w:rFonts w:ascii="Arial" w:hAnsi="Arial" w:cs="Arial"/>
           <w:sz w:val="32"/>
           <w:szCs w:val="32"/>
           <w:lang w:eastAsia="zh-CN"/>
@@ -616,15 +625,16 @@
           <w:sz w:val="32"/>
           <w:szCs w:val="32"/>
         </w:rPr>
-        <w:t xml:space="preserve"> [</w:t>
-      </w:r>
-      <w:r>
-        <w:rPr>
-          <w:rFonts w:ascii="Arial" w:hAnsi="Arial" w:cs="Arial"/>
+        <w:t xml:space="preserve"> </w:t>
+      </w:r>
+      <w:r>
+        <w:rPr>
+          <w:rFonts w:ascii="Arial" w:hAnsi="Arial" w:cs="Arial" w:hint="eastAsia"/>
           <w:sz w:val="32"/>
           <w:szCs w:val="32"/>
-        </w:rPr>
-        <w:t>Date of Last Review</w:t>
+          <w:lang w:eastAsia="zh-CN"/>
+        </w:rPr>
+        <w:t>03/11/2025</w:t>
       </w:r>
       <w:r>
         <w:rPr>
@@ -632,25 +642,33 @@
           <w:sz w:val="32"/>
           <w:szCs w:val="32"/>
         </w:rPr>
-        <w:t xml:space="preserve">] to [Date of this Review] </w:t>
-      </w:r>
-    </w:p>
-    <w:p>
-      <w:pPr>
-        <w:rPr>
-          <w:rFonts w:ascii="Arial" w:hAnsi="Arial" w:cs="Arial"/>
+        <w:t xml:space="preserve"> to </w:t>
+      </w:r>
+      <w:r>
+        <w:rPr>
+          <w:rFonts w:ascii="Arial" w:hAnsi="Arial" w:cs="Arial" w:hint="eastAsia"/>
           <w:sz w:val="32"/>
           <w:szCs w:val="32"/>
-        </w:rPr>
-      </w:pPr>
-    </w:p>
-    <w:p>
-      <w:pPr>
+          <w:lang w:eastAsia="zh-CN"/>
+        </w:rPr>
+        <w:t>27/02/2026</w:t>
+      </w:r>
+      <w:r>
         <w:rPr>
           <w:rFonts w:ascii="Arial" w:hAnsi="Arial" w:cs="Arial"/>
           <w:sz w:val="32"/>
           <w:szCs w:val="32"/>
         </w:rPr>
+        <w:t xml:space="preserve"> </w:t>
+      </w:r>
+    </w:p>
+    <w:p>
+      <w:pPr>
+        <w:rPr>
+          <w:rFonts w:ascii="Arial" w:hAnsi="Arial" w:cs="Arial"/>
+          <w:sz w:val="32"/>
+          <w:szCs w:val="32"/>
+        </w:rPr>
       </w:pPr>
     </w:p>
     <w:p>
@@ -700,124 +718,139 @@
           <w:rFonts w:ascii="Arial" w:hAnsi="Arial" w:cs="Arial"/>
           <w:sz w:val="22"/>
           <w:szCs w:val="22"/>
-        </w:rPr>
-      </w:pPr>
-      <w:r>
-        <w:rPr>
-          <w:rFonts w:ascii="Arial" w:hAnsi="Arial" w:cs="Arial"/>
-          <w:sz w:val="22"/>
-          <w:szCs w:val="22"/>
-        </w:rPr>
-        <w:t xml:space="preserve">One paragraph should give a summary of the project's </w:t>
-      </w:r>
-      <w:r>
-        <w:rPr>
-          <w:rFonts w:ascii="Arial" w:hAnsi="Arial" w:cs="Arial"/>
-          <w:sz w:val="22"/>
-          <w:szCs w:val="22"/>
-        </w:rPr>
-        <w:t>status</w:t>
-      </w:r>
-      <w:r>
-        <w:rPr>
-          <w:rFonts w:ascii="Arial" w:hAnsi="Arial" w:cs="Arial"/>
-          <w:sz w:val="22"/>
-          <w:szCs w:val="22"/>
-        </w:rPr>
-        <w:t xml:space="preserve">. </w:t>
-      </w:r>
-      <w:r>
-        <w:rPr>
-          <w:rFonts w:ascii="Arial" w:hAnsi="Arial" w:cs="Arial"/>
-          <w:sz w:val="22"/>
-          <w:szCs w:val="22"/>
-        </w:rPr>
-        <w:t xml:space="preserve"> </w:t>
-      </w:r>
-    </w:p>
-    <w:p>
-      <w:pPr>
-        <w:pStyle w:val="a9"/>
-        <w:numPr>
-          <w:ilvl w:val="0"/>
-          <w:numId w:val="19"/>
-        </w:numPr>
-        <w:rPr>
-          <w:rFonts w:ascii="Arial" w:hAnsi="Arial" w:cs="Arial"/>
-          <w:sz w:val="22"/>
-          <w:szCs w:val="22"/>
-        </w:rPr>
-      </w:pPr>
-      <w:r>
-        <w:rPr>
-          <w:rFonts w:ascii="Arial" w:hAnsi="Arial" w:cs="Arial"/>
-          <w:sz w:val="22"/>
-          <w:szCs w:val="22"/>
-        </w:rPr>
-        <w:t xml:space="preserve">Begin by stating the project's </w:t>
-      </w:r>
-      <w:r>
-        <w:rPr>
-          <w:rFonts w:ascii="Arial" w:hAnsi="Arial" w:cs="Arial"/>
-          <w:sz w:val="22"/>
-          <w:szCs w:val="22"/>
-        </w:rPr>
-        <w:t>status</w:t>
-      </w:r>
-      <w:r>
-        <w:rPr>
-          <w:rFonts w:ascii="Arial" w:hAnsi="Arial" w:cs="Arial"/>
-          <w:sz w:val="22"/>
-          <w:szCs w:val="22"/>
-        </w:rPr>
-        <w:t xml:space="preserve"> (e.g., </w:t>
-      </w:r>
-      <w:r>
-        <w:rPr>
-          <w:rFonts w:ascii="Arial" w:hAnsi="Arial" w:cs="Arial"/>
-          <w:sz w:val="22"/>
-          <w:szCs w:val="22"/>
-        </w:rPr>
-        <w:t xml:space="preserve">the </w:t>
-      </w:r>
-      <w:r>
-        <w:rPr>
-          <w:rFonts w:ascii="Arial" w:hAnsi="Arial" w:cs="Arial"/>
-          <w:sz w:val="22"/>
-          <w:szCs w:val="22"/>
-        </w:rPr>
-        <w:t>project is now in the advanced prototyping and initial testing phase...").</w:t>
-      </w:r>
-    </w:p>
-    <w:p>
-      <w:pPr>
-        <w:pStyle w:val="a9"/>
-        <w:numPr>
-          <w:ilvl w:val="0"/>
-          <w:numId w:val="19"/>
-        </w:numPr>
-        <w:rPr>
-          <w:rFonts w:ascii="Arial" w:hAnsi="Arial" w:cs="Arial"/>
-          <w:sz w:val="22"/>
-          <w:szCs w:val="22"/>
-        </w:rPr>
-      </w:pPr>
-      <w:r>
-        <w:rPr>
-          <w:rFonts w:ascii="Arial" w:hAnsi="Arial" w:cs="Arial"/>
-          <w:sz w:val="22"/>
-          <w:szCs w:val="22"/>
-        </w:rPr>
-        <w:t>Summarise the main activities completed since the last review, such as finalising the core algorithm, finishing data collection, or developing the primary user interface.</w:t>
-      </w:r>
-    </w:p>
-    <w:p>
-      <w:pPr>
-        <w:pStyle w:val="a9"/>
-        <w:numPr>
-          <w:ilvl w:val="0"/>
-          <w:numId w:val="19"/>
-        </w:numPr>
+          <w:lang w:eastAsia="zh-CN"/>
+        </w:rPr>
+      </w:pPr>
+      <w:r>
+        <w:rPr>
+          <w:rFonts w:ascii="Arial" w:hAnsi="Arial" w:cs="Arial"/>
+          <w:sz w:val="22"/>
+          <w:szCs w:val="22"/>
+        </w:rPr>
+        <w:t xml:space="preserve">This project has been into Model Development and System </w:t>
+      </w:r>
+      <w:r>
+        <w:rPr>
+          <w:rFonts w:ascii="Arial" w:hAnsi="Arial" w:cs="Arial" w:hint="eastAsia"/>
+          <w:sz w:val="22"/>
+          <w:szCs w:val="22"/>
+          <w:lang w:eastAsia="zh-CN"/>
+        </w:rPr>
+        <w:t xml:space="preserve">merge period. </w:t>
+      </w:r>
+      <w:r>
+        <w:rPr>
+          <w:rFonts w:ascii="Arial" w:hAnsi="Arial" w:cs="Arial"/>
+          <w:sz w:val="22"/>
+          <w:szCs w:val="22"/>
+          <w:lang w:eastAsia="zh-CN"/>
+        </w:rPr>
+        <w:t>Compared</w:t>
+      </w:r>
+      <w:r>
+        <w:rPr>
+          <w:rFonts w:ascii="Arial" w:hAnsi="Arial" w:cs="Arial" w:hint="eastAsia"/>
+          <w:sz w:val="22"/>
+          <w:szCs w:val="22"/>
+          <w:lang w:eastAsia="zh-CN"/>
+        </w:rPr>
+        <w:t xml:space="preserve"> to last report, the core mission had changed to merge the AI model and optimize system. Now, the core module of speech recognition had almost ready to merge to application. Also, the project had finished from voice to word processing based on Whisper.cpp by using the offline Chinese speech-to-text function. Now system can load </w:t>
+      </w:r>
+      <w:r>
+        <w:rPr>
+          <w:rFonts w:ascii="Arial" w:hAnsi="Arial" w:cs="Arial"/>
+          <w:sz w:val="22"/>
+          <w:szCs w:val="22"/>
+          <w:lang w:eastAsia="zh-CN"/>
+        </w:rPr>
+        <w:t>‘</w:t>
+      </w:r>
+      <w:r>
+        <w:rPr>
+          <w:rFonts w:ascii="Arial" w:hAnsi="Arial" w:cs="Arial" w:hint="eastAsia"/>
+          <w:sz w:val="22"/>
+          <w:szCs w:val="22"/>
+          <w:lang w:eastAsia="zh-CN"/>
+        </w:rPr>
+        <w:t>ggml</w:t>
+      </w:r>
+      <w:r>
+        <w:rPr>
+          <w:rFonts w:ascii="Arial" w:hAnsi="Arial" w:cs="Arial"/>
+          <w:sz w:val="22"/>
+          <w:szCs w:val="22"/>
+          <w:lang w:eastAsia="zh-CN"/>
+        </w:rPr>
+        <w:t>’</w:t>
+      </w:r>
+      <w:r>
+        <w:rPr>
+          <w:rFonts w:ascii="Arial" w:hAnsi="Arial" w:cs="Arial" w:hint="eastAsia"/>
+          <w:sz w:val="22"/>
+          <w:szCs w:val="22"/>
+          <w:lang w:eastAsia="zh-CN"/>
+        </w:rPr>
+        <w:t xml:space="preserve"> module and handle the basic speech reasoning processing.</w:t>
+      </w:r>
+    </w:p>
+    <w:p>
+      <w:pPr>
+        <w:rPr>
+          <w:rFonts w:ascii="Arial" w:hAnsi="Arial" w:cs="Arial"/>
+          <w:sz w:val="22"/>
+          <w:szCs w:val="22"/>
+          <w:lang w:eastAsia="zh-CN"/>
+        </w:rPr>
+      </w:pPr>
+      <w:r>
+        <w:rPr>
+          <w:rFonts w:ascii="Arial" w:hAnsi="Arial" w:cs="Arial"/>
+          <w:sz w:val="22"/>
+          <w:szCs w:val="22"/>
+          <w:lang w:eastAsia="zh-CN"/>
+        </w:rPr>
+        <w:t>The main tasks completed in this phase included: building the CMake build system, resolving Visual Studio compilation errors (such as standard library compatibility issues), debugging model loading logic, testing GPU acceleration options (including flash attention configuration), and initially building the user interface structure. Simultaneously, a systematic investigation and fix were performed on path management and dependency library linking issues in the Windows environment, but these have not yet been tested on mobile devices. Additionally, the packaging functionality based on Linux systems still requires acceleration and fixes.</w:t>
+      </w:r>
+    </w:p>
+    <w:p>
+      <w:pPr>
+        <w:rPr>
+          <w:rFonts w:ascii="Arial" w:hAnsi="Arial" w:cs="Arial"/>
+          <w:sz w:val="22"/>
+          <w:szCs w:val="22"/>
+          <w:lang w:eastAsia="zh-CN"/>
+        </w:rPr>
+      </w:pPr>
+      <w:r>
+        <w:rPr>
+          <w:rFonts w:ascii="Arial" w:hAnsi="Arial" w:cs="Arial"/>
+          <w:sz w:val="22"/>
+          <w:szCs w:val="22"/>
+          <w:lang w:eastAsia="zh-CN"/>
+        </w:rPr>
+        <w:t xml:space="preserve">Currently, the project has a working prototype. The most important </w:t>
+      </w:r>
+      <w:r>
+        <w:rPr>
+          <w:rFonts w:ascii="Arial" w:hAnsi="Arial" w:cs="Arial" w:hint="eastAsia"/>
+          <w:sz w:val="22"/>
+          <w:szCs w:val="22"/>
+          <w:lang w:eastAsia="zh-CN"/>
+        </w:rPr>
+        <w:t>task</w:t>
+      </w:r>
+      <w:r>
+        <w:rPr>
+          <w:rFonts w:ascii="Arial" w:hAnsi="Arial" w:cs="Arial"/>
+          <w:sz w:val="22"/>
+          <w:szCs w:val="22"/>
+          <w:lang w:eastAsia="zh-CN"/>
+        </w:rPr>
+        <w:t xml:space="preserve"> is the successful transformation of the theoretical design into a locally run practical system, and the verification of the feasibility of the offline speech recognition solution on personal devices. This lays the technical foundation for the subsequent development of a vocal feedback mechanism.</w:t>
+      </w:r>
+    </w:p>
+    <w:p>
+      <w:pPr>
         <w:rPr>
           <w:rFonts w:ascii="Arial" w:hAnsi="Arial" w:cs="Arial"/>
           <w:b/>
@@ -829,23 +862,16 @@
       <w:r>
         <w:rPr>
           <w:rFonts w:ascii="Arial" w:hAnsi="Arial" w:cs="Arial"/>
-          <w:sz w:val="22"/>
-          <w:szCs w:val="22"/>
-        </w:rPr>
-        <w:t xml:space="preserve">Conclude with a sentence on the most significant findings or developments, emphasising how they have shaped the project's direction </w:t>
-      </w:r>
-    </w:p>
-    <w:p>
-      <w:pPr>
-        <w:rPr>
-          <w:rFonts w:ascii="Arial" w:hAnsi="Arial" w:cs="Arial"/>
           <w:b/>
           <w:bCs/>
           <w:sz w:val="22"/>
           <w:szCs w:val="22"/>
         </w:rPr>
-      </w:pPr>
-      <w:r>
+        <w:t>2.0 Artefact Design and Development</w:t>
+      </w:r>
+    </w:p>
+    <w:p>
+      <w:pPr>
         <w:rPr>
           <w:rFonts w:ascii="Arial" w:hAnsi="Arial" w:cs="Arial"/>
           <w:b/>
@@ -853,28 +879,8 @@
           <w:sz w:val="22"/>
           <w:szCs w:val="22"/>
         </w:rPr>
-        <w:t>2.0 Artefact Design and Development</w:t>
-      </w:r>
-    </w:p>
-    <w:p>
-      <w:pPr>
-        <w:rPr>
-          <w:rFonts w:ascii="Arial" w:hAnsi="Arial" w:cs="Arial"/>
-          <w:sz w:val="22"/>
-          <w:szCs w:val="22"/>
-        </w:rPr>
-      </w:pPr>
-      <w:r>
-        <w:rPr>
-          <w:rFonts w:ascii="Arial" w:hAnsi="Arial" w:cs="Arial"/>
-          <w:sz w:val="22"/>
-          <w:szCs w:val="22"/>
-        </w:rPr>
-        <w:t>This section is the core of the report, highlighting your real achievements and sharing your insightful thoughts about the work. It is more than just a list of what’s been done; it is about understanding why it matters.</w:t>
-      </w:r>
-    </w:p>
-    <w:p>
-      <w:pPr>
+      </w:pPr>
+      <w:r>
         <w:rPr>
           <w:rFonts w:ascii="Arial" w:hAnsi="Arial" w:cs="Arial"/>
           <w:b/>
@@ -882,8 +888,396 @@
           <w:sz w:val="22"/>
           <w:szCs w:val="22"/>
         </w:rPr>
-      </w:pPr>
-      <w:r>
+        <w:t>2.1 Implementation and Current State</w:t>
+      </w:r>
+    </w:p>
+    <w:p>
+      <w:pPr>
+        <w:rPr>
+          <w:rFonts w:ascii="Arial" w:hAnsi="Arial" w:cs="Arial"/>
+          <w:sz w:val="22"/>
+          <w:szCs w:val="22"/>
+        </w:rPr>
+      </w:pPr>
+      <w:r>
+        <w:rPr>
+          <w:rFonts w:ascii="Arial" w:hAnsi="Arial" w:cs="Arial"/>
+          <w:sz w:val="22"/>
+          <w:szCs w:val="22"/>
+        </w:rPr>
+        <w:t xml:space="preserve">Regarding the core model: The system implements offline automatic speech recognition based on whisper.cpp. The model is loaded in ggml format, and GPU acceleration can be enabled or disabled depending on the device. </w:t>
+      </w:r>
+    </w:p>
+    <w:p>
+      <w:pPr>
+        <w:rPr>
+          <w:rFonts w:ascii="Arial" w:hAnsi="Arial" w:cs="Arial"/>
+          <w:sz w:val="22"/>
+          <w:szCs w:val="22"/>
+          <w:lang w:eastAsia="zh-CN"/>
+        </w:rPr>
+      </w:pPr>
+      <w:r>
+        <w:rPr>
+          <w:rFonts w:ascii="Arial" w:hAnsi="Arial" w:cs="Arial"/>
+          <w:sz w:val="22"/>
+          <w:szCs w:val="22"/>
+        </w:rPr>
+        <w:t>This module has implemented:</w:t>
+      </w:r>
+    </w:p>
+    <w:p>
+      <w:pPr>
+        <w:rPr>
+          <w:rFonts w:ascii="Arial" w:hAnsi="Arial" w:cs="Arial"/>
+          <w:sz w:val="22"/>
+          <w:szCs w:val="22"/>
+          <w:lang w:eastAsia="zh-CN"/>
+        </w:rPr>
+      </w:pPr>
+      <w:r>
+        <w:rPr>
+          <w:rFonts w:ascii="Arial" w:hAnsi="Arial" w:cs="Arial" w:hint="eastAsia"/>
+          <w:sz w:val="22"/>
+          <w:szCs w:val="22"/>
+        </w:rPr>
+        <w:t>•</w:t>
+      </w:r>
+      <w:r>
+        <w:rPr>
+          <w:rFonts w:ascii="Arial" w:hAnsi="Arial" w:cs="Arial"/>
+          <w:sz w:val="22"/>
+          <w:szCs w:val="22"/>
+        </w:rPr>
+        <w:t xml:space="preserve"> Local model loading</w:t>
+      </w:r>
+    </w:p>
+    <w:p>
+      <w:pPr>
+        <w:rPr>
+          <w:rFonts w:ascii="Arial" w:hAnsi="Arial" w:cs="Arial"/>
+          <w:sz w:val="22"/>
+          <w:szCs w:val="22"/>
+          <w:lang w:eastAsia="zh-CN"/>
+        </w:rPr>
+      </w:pPr>
+      <w:r>
+        <w:rPr>
+          <w:rFonts w:ascii="Arial" w:hAnsi="Arial" w:cs="Arial" w:hint="eastAsia"/>
+          <w:sz w:val="22"/>
+          <w:szCs w:val="22"/>
+        </w:rPr>
+        <w:t>•</w:t>
+      </w:r>
+      <w:r>
+        <w:rPr>
+          <w:rFonts w:ascii="Arial" w:hAnsi="Arial" w:cs="Arial"/>
+          <w:sz w:val="22"/>
+          <w:szCs w:val="22"/>
+        </w:rPr>
+        <w:t xml:space="preserve"> Inference parameter control</w:t>
+      </w:r>
+    </w:p>
+    <w:p>
+      <w:pPr>
+        <w:rPr>
+          <w:rFonts w:ascii="Arial" w:hAnsi="Arial" w:cs="Arial"/>
+          <w:sz w:val="22"/>
+          <w:szCs w:val="22"/>
+          <w:lang w:eastAsia="zh-CN"/>
+        </w:rPr>
+      </w:pPr>
+      <w:r>
+        <w:rPr>
+          <w:rFonts w:ascii="Arial" w:hAnsi="Arial" w:cs="Arial" w:hint="eastAsia"/>
+          <w:sz w:val="22"/>
+          <w:szCs w:val="22"/>
+        </w:rPr>
+        <w:t>•</w:t>
+      </w:r>
+      <w:r>
+        <w:rPr>
+          <w:rFonts w:ascii="Arial" w:hAnsi="Arial" w:cs="Arial"/>
+          <w:sz w:val="22"/>
+          <w:szCs w:val="22"/>
+        </w:rPr>
+        <w:t xml:space="preserve"> Basic speech-to-text output</w:t>
+      </w:r>
+    </w:p>
+    <w:p>
+      <w:pPr>
+        <w:rPr>
+          <w:rFonts w:ascii="Arial" w:hAnsi="Arial" w:cs="Arial"/>
+          <w:sz w:val="22"/>
+          <w:szCs w:val="22"/>
+          <w:lang w:eastAsia="zh-CN"/>
+        </w:rPr>
+      </w:pPr>
+      <w:r>
+        <w:rPr>
+          <w:rFonts w:ascii="Arial" w:hAnsi="Arial" w:cs="Arial"/>
+          <w:sz w:val="22"/>
+          <w:szCs w:val="22"/>
+        </w:rPr>
+        <w:t>Through testing and verification, the system can stably complete phrase-level Chinese speech recognition.</w:t>
+      </w:r>
+    </w:p>
+    <w:p>
+      <w:pPr>
+        <w:rPr>
+          <w:rFonts w:ascii="Arial" w:hAnsi="Arial" w:cs="Arial"/>
+          <w:sz w:val="22"/>
+          <w:szCs w:val="22"/>
+          <w:lang w:eastAsia="zh-CN"/>
+        </w:rPr>
+      </w:pPr>
+      <w:r>
+        <w:rPr>
+          <w:rFonts w:ascii="Arial" w:hAnsi="Arial" w:cs="Arial"/>
+          <w:sz w:val="22"/>
+          <w:szCs w:val="22"/>
+        </w:rPr>
+        <w:t>Regarding system and technology integration: The project uses CMake for build management, integrating whisper and ggml source code. Several key issues were encountered and resolved during development, including:</w:t>
+      </w:r>
+    </w:p>
+    <w:p>
+      <w:pPr>
+        <w:rPr>
+          <w:rFonts w:ascii="Arial" w:hAnsi="Arial" w:cs="Arial"/>
+          <w:sz w:val="22"/>
+          <w:szCs w:val="22"/>
+          <w:lang w:eastAsia="zh-CN"/>
+        </w:rPr>
+      </w:pPr>
+      <w:r>
+        <w:rPr>
+          <w:rFonts w:ascii="Arial" w:hAnsi="Arial" w:cs="Arial" w:hint="eastAsia"/>
+          <w:sz w:val="22"/>
+          <w:szCs w:val="22"/>
+        </w:rPr>
+        <w:t>•</w:t>
+      </w:r>
+      <w:r>
+        <w:rPr>
+          <w:rFonts w:ascii="Arial" w:hAnsi="Arial" w:cs="Arial"/>
+          <w:sz w:val="22"/>
+          <w:szCs w:val="22"/>
+        </w:rPr>
+        <w:t xml:space="preserve"> std::clamp error (caused by inconsistent compilation standard versions)</w:t>
+      </w:r>
+    </w:p>
+    <w:p>
+      <w:pPr>
+        <w:rPr>
+          <w:rFonts w:ascii="Arial" w:hAnsi="Arial" w:cs="Arial"/>
+          <w:sz w:val="22"/>
+          <w:szCs w:val="22"/>
+          <w:lang w:eastAsia="zh-CN"/>
+        </w:rPr>
+      </w:pPr>
+      <w:r>
+        <w:rPr>
+          <w:rFonts w:ascii="Arial" w:hAnsi="Arial" w:cs="Arial" w:hint="eastAsia"/>
+          <w:sz w:val="22"/>
+          <w:szCs w:val="22"/>
+        </w:rPr>
+        <w:t>•</w:t>
+      </w:r>
+      <w:r>
+        <w:rPr>
+          <w:rFonts w:ascii="Arial" w:hAnsi="Arial" w:cs="Arial"/>
+          <w:sz w:val="22"/>
+          <w:szCs w:val="22"/>
+        </w:rPr>
+        <w:t xml:space="preserve"> Windows path reading exception</w:t>
+      </w:r>
+    </w:p>
+    <w:p>
+      <w:pPr>
+        <w:rPr>
+          <w:rFonts w:ascii="Arial" w:hAnsi="Arial" w:cs="Arial"/>
+          <w:sz w:val="22"/>
+          <w:szCs w:val="22"/>
+          <w:lang w:eastAsia="zh-CN"/>
+        </w:rPr>
+      </w:pPr>
+      <w:r>
+        <w:rPr>
+          <w:rFonts w:ascii="Arial" w:hAnsi="Arial" w:cs="Arial" w:hint="eastAsia"/>
+          <w:sz w:val="22"/>
+          <w:szCs w:val="22"/>
+        </w:rPr>
+        <w:lastRenderedPageBreak/>
+        <w:t>•</w:t>
+      </w:r>
+      <w:r>
+        <w:rPr>
+          <w:rFonts w:ascii="Arial" w:hAnsi="Arial" w:cs="Arial"/>
+          <w:sz w:val="22"/>
+          <w:szCs w:val="22"/>
+        </w:rPr>
+        <w:t xml:space="preserve"> GPU backend configuration conflict issue</w:t>
+      </w:r>
+    </w:p>
+    <w:p>
+      <w:pPr>
+        <w:rPr>
+          <w:rFonts w:ascii="Arial" w:hAnsi="Arial" w:cs="Arial"/>
+          <w:sz w:val="22"/>
+          <w:szCs w:val="22"/>
+          <w:lang w:eastAsia="zh-CN"/>
+        </w:rPr>
+      </w:pPr>
+      <w:r>
+        <w:rPr>
+          <w:rFonts w:ascii="Arial" w:hAnsi="Arial" w:cs="Arial"/>
+          <w:sz w:val="22"/>
+          <w:szCs w:val="22"/>
+        </w:rPr>
+        <w:t>By adjusting the compiler standard, modifying the code structure, and optimizing build parameters, system stability has been significantly improved.</w:t>
+      </w:r>
+    </w:p>
+    <w:p>
+      <w:pPr>
+        <w:rPr>
+          <w:rFonts w:ascii="Arial" w:hAnsi="Arial" w:cs="Arial"/>
+          <w:sz w:val="22"/>
+          <w:szCs w:val="22"/>
+          <w:lang w:eastAsia="zh-CN"/>
+        </w:rPr>
+      </w:pPr>
+      <w:r>
+        <w:rPr>
+          <w:rFonts w:ascii="Arial" w:hAnsi="Arial" w:cs="Arial"/>
+          <w:sz w:val="22"/>
+          <w:szCs w:val="22"/>
+        </w:rPr>
+        <w:t>Regarding the UI: The basic interface framework has been built, implementing the following functions:</w:t>
+      </w:r>
+    </w:p>
+    <w:p>
+      <w:pPr>
+        <w:rPr>
+          <w:rFonts w:ascii="Arial" w:hAnsi="Arial" w:cs="Arial"/>
+          <w:sz w:val="22"/>
+          <w:szCs w:val="22"/>
+          <w:lang w:eastAsia="zh-CN"/>
+        </w:rPr>
+      </w:pPr>
+      <w:r>
+        <w:rPr>
+          <w:rFonts w:ascii="Arial" w:hAnsi="Arial" w:cs="Arial" w:hint="eastAsia"/>
+          <w:sz w:val="22"/>
+          <w:szCs w:val="22"/>
+        </w:rPr>
+        <w:t>•</w:t>
+      </w:r>
+      <w:r>
+        <w:rPr>
+          <w:rFonts w:ascii="Arial" w:hAnsi="Arial" w:cs="Arial"/>
+          <w:sz w:val="22"/>
+          <w:szCs w:val="22"/>
+        </w:rPr>
+        <w:t xml:space="preserve"> Model loading button</w:t>
+      </w:r>
+    </w:p>
+    <w:p>
+      <w:pPr>
+        <w:rPr>
+          <w:rFonts w:ascii="Arial" w:hAnsi="Arial" w:cs="Arial"/>
+          <w:sz w:val="22"/>
+          <w:szCs w:val="22"/>
+          <w:lang w:eastAsia="zh-CN"/>
+        </w:rPr>
+      </w:pPr>
+      <w:r>
+        <w:rPr>
+          <w:rFonts w:ascii="Arial" w:hAnsi="Arial" w:cs="Arial" w:hint="eastAsia"/>
+          <w:sz w:val="22"/>
+          <w:szCs w:val="22"/>
+        </w:rPr>
+        <w:t>•</w:t>
+      </w:r>
+      <w:r>
+        <w:rPr>
+          <w:rFonts w:ascii="Arial" w:hAnsi="Arial" w:cs="Arial"/>
+          <w:sz w:val="22"/>
+          <w:szCs w:val="22"/>
+        </w:rPr>
+        <w:t xml:space="preserve"> Recording start and stop control</w:t>
+      </w:r>
+    </w:p>
+    <w:p>
+      <w:pPr>
+        <w:rPr>
+          <w:rFonts w:ascii="Arial" w:hAnsi="Arial" w:cs="Arial"/>
+          <w:sz w:val="22"/>
+          <w:szCs w:val="22"/>
+          <w:lang w:eastAsia="zh-CN"/>
+        </w:rPr>
+      </w:pPr>
+      <w:r>
+        <w:rPr>
+          <w:rFonts w:ascii="Arial" w:hAnsi="Arial" w:cs="Arial" w:hint="eastAsia"/>
+          <w:sz w:val="22"/>
+          <w:szCs w:val="22"/>
+        </w:rPr>
+        <w:t>•</w:t>
+      </w:r>
+      <w:r>
+        <w:rPr>
+          <w:rFonts w:ascii="Arial" w:hAnsi="Arial" w:cs="Arial"/>
+          <w:sz w:val="22"/>
+          <w:szCs w:val="22"/>
+        </w:rPr>
+        <w:t xml:space="preserve"> Real-time transcription text display</w:t>
+      </w:r>
+    </w:p>
+    <w:p>
+      <w:pPr>
+        <w:rPr>
+          <w:rFonts w:ascii="Arial" w:hAnsi="Arial" w:cs="Arial"/>
+          <w:sz w:val="22"/>
+          <w:szCs w:val="22"/>
+          <w:lang w:eastAsia="zh-CN"/>
+        </w:rPr>
+      </w:pPr>
+      <w:r>
+        <w:rPr>
+          <w:rFonts w:ascii="Arial" w:hAnsi="Arial" w:cs="Arial" w:hint="eastAsia"/>
+          <w:sz w:val="22"/>
+          <w:szCs w:val="22"/>
+        </w:rPr>
+        <w:t>•</w:t>
+      </w:r>
+      <w:r>
+        <w:rPr>
+          <w:rFonts w:ascii="Arial" w:hAnsi="Arial" w:cs="Arial"/>
+          <w:sz w:val="22"/>
+          <w:szCs w:val="22"/>
+        </w:rPr>
+        <w:t xml:space="preserve"> Reserved result feedback area</w:t>
+      </w:r>
+    </w:p>
+    <w:p>
+      <w:pPr>
+        <w:rPr>
+          <w:rFonts w:ascii="Arial" w:hAnsi="Arial" w:cs="Arial"/>
+          <w:sz w:val="22"/>
+          <w:szCs w:val="22"/>
+        </w:rPr>
+      </w:pPr>
+      <w:r>
+        <w:rPr>
+          <w:rFonts w:ascii="Arial" w:hAnsi="Arial" w:cs="Arial"/>
+          <w:sz w:val="22"/>
+          <w:szCs w:val="22"/>
+        </w:rPr>
+        <w:t>Although the current interface is still mainly for functional verification and the visual design has not yet been optimized, the functional logic is basically complete.</w:t>
+      </w:r>
+    </w:p>
+    <w:p>
+      <w:pPr>
         <w:rPr>
           <w:rFonts w:ascii="Arial" w:hAnsi="Arial" w:cs="Arial"/>
           <w:b/>
@@ -891,113 +1285,8 @@
           <w:sz w:val="22"/>
           <w:szCs w:val="22"/>
         </w:rPr>
-        <w:t>2.1 Implementation and Current State</w:t>
-      </w:r>
-    </w:p>
-    <w:p>
-      <w:pPr>
-        <w:rPr>
-          <w:rFonts w:ascii="Arial" w:hAnsi="Arial" w:cs="Arial"/>
-          <w:sz w:val="22"/>
-          <w:szCs w:val="22"/>
-        </w:rPr>
-      </w:pPr>
-      <w:r>
-        <w:rPr>
-          <w:rFonts w:ascii="Arial" w:hAnsi="Arial" w:cs="Arial"/>
-          <w:sz w:val="22"/>
-          <w:szCs w:val="22"/>
-        </w:rPr>
-        <w:t>Here is where you showcase tangible evidence of your work, including experimental results, mock-ups, software components, or analytical findings. Use visuals like screenshots, diagrams, data tables, or code snippets to illustrate progress. Briefly describe each element's function and purpose.</w:t>
-      </w:r>
-    </w:p>
-    <w:p>
-      <w:pPr>
-        <w:rPr>
-          <w:rFonts w:ascii="Arial" w:hAnsi="Arial" w:cs="Arial"/>
-          <w:sz w:val="22"/>
-          <w:szCs w:val="22"/>
-        </w:rPr>
-      </w:pPr>
-      <w:r>
-        <w:rPr>
-          <w:rFonts w:ascii="Arial" w:hAnsi="Arial" w:cs="Arial"/>
-          <w:sz w:val="22"/>
-          <w:szCs w:val="22"/>
-        </w:rPr>
-        <w:t xml:space="preserve">For </w:t>
-      </w:r>
-      <w:r>
-        <w:rPr>
-          <w:rFonts w:ascii="Arial" w:hAnsi="Arial" w:cs="Arial"/>
-          <w:sz w:val="22"/>
-          <w:szCs w:val="22"/>
-        </w:rPr>
-        <w:t>Example</w:t>
-      </w:r>
-      <w:r>
-        <w:rPr>
-          <w:rFonts w:ascii="Arial" w:hAnsi="Arial" w:cs="Arial"/>
-          <w:sz w:val="22"/>
-          <w:szCs w:val="22"/>
-        </w:rPr>
-        <w:t>,</w:t>
-      </w:r>
-      <w:r>
-        <w:rPr>
-          <w:rFonts w:ascii="Arial" w:hAnsi="Arial" w:cs="Arial"/>
-          <w:sz w:val="22"/>
-          <w:szCs w:val="22"/>
-        </w:rPr>
-        <w:t xml:space="preserve"> </w:t>
-      </w:r>
-    </w:p>
-    <w:p>
-      <w:pPr>
-        <w:pStyle w:val="a9"/>
-        <w:numPr>
-          <w:ilvl w:val="0"/>
-          <w:numId w:val="20"/>
-        </w:numPr>
-        <w:rPr>
-          <w:rFonts w:ascii="Arial" w:hAnsi="Arial" w:cs="Arial"/>
-          <w:sz w:val="22"/>
-          <w:szCs w:val="22"/>
-        </w:rPr>
-      </w:pPr>
-      <w:r>
-        <w:rPr>
-          <w:rFonts w:ascii="Arial" w:hAnsi="Arial" w:cs="Arial"/>
-          <w:sz w:val="22"/>
-          <w:szCs w:val="22"/>
-        </w:rPr>
-        <w:t>For a software project, include a screenshot of the main UI, a key algorithm snippet, and a database schema diagram.</w:t>
-      </w:r>
-    </w:p>
-    <w:p>
-      <w:pPr>
-        <w:pStyle w:val="a9"/>
-        <w:numPr>
-          <w:ilvl w:val="0"/>
-          <w:numId w:val="20"/>
-        </w:numPr>
-        <w:rPr>
-          <w:rFonts w:ascii="Arial" w:hAnsi="Arial" w:cs="Arial"/>
-          <w:sz w:val="22"/>
-          <w:szCs w:val="22"/>
-        </w:rPr>
-      </w:pPr>
-      <w:r>
-        <w:rPr>
-          <w:rFonts w:ascii="Arial" w:hAnsi="Arial" w:cs="Arial"/>
-          <w:sz w:val="22"/>
-          <w:szCs w:val="22"/>
-        </w:rPr>
-        <w:t>For an experimental project, include a table of results, a trend graph, and a photo of the setup.</w:t>
-      </w:r>
-    </w:p>
-    <w:p>
-      <w:pPr>
+      </w:pPr>
+      <w:r>
         <w:rPr>
           <w:rFonts w:ascii="Arial" w:hAnsi="Arial" w:cs="Arial"/>
           <w:b/>
@@ -1005,8 +1294,191 @@
           <w:sz w:val="22"/>
           <w:szCs w:val="22"/>
         </w:rPr>
-      </w:pPr>
-      <w:r>
+        <w:t>2.2 Analysis and Reflection</w:t>
+      </w:r>
+    </w:p>
+    <w:p>
+      <w:pPr>
+        <w:rPr>
+          <w:rFonts w:ascii="Arial" w:hAnsi="Arial" w:cs="Arial"/>
+          <w:sz w:val="22"/>
+          <w:szCs w:val="22"/>
+          <w:lang w:eastAsia="zh-CN"/>
+        </w:rPr>
+      </w:pPr>
+      <w:r>
+        <w:rPr>
+          <w:rFonts w:ascii="Arial" w:hAnsi="Arial" w:cs="Arial"/>
+          <w:sz w:val="22"/>
+          <w:szCs w:val="22"/>
+          <w:lang w:eastAsia="zh-CN"/>
+        </w:rPr>
+        <w:t>During this phase of development, I gained a deeper understanding of the complexities of offline AI model deployment and system integration. Initially, it seemed that speech recognition primarily relied on the model's capabilities, but in practice, the real challenges lay in engineering-level integration issues, such as memory management, compiler compatibility, and hardware acceleration support.</w:t>
+      </w:r>
+    </w:p>
+    <w:p>
+      <w:pPr>
+        <w:rPr>
+          <w:rFonts w:ascii="Arial" w:hAnsi="Arial" w:cs="Arial"/>
+          <w:sz w:val="22"/>
+          <w:szCs w:val="22"/>
+          <w:lang w:eastAsia="zh-CN"/>
+        </w:rPr>
+      </w:pPr>
+      <w:r>
+        <w:rPr>
+          <w:rFonts w:ascii="Arial" w:hAnsi="Arial" w:cs="Arial"/>
+          <w:sz w:val="22"/>
+          <w:szCs w:val="22"/>
+          <w:lang w:eastAsia="zh-CN"/>
+        </w:rPr>
+        <w:t>Secondly, in initial testing, I discovered that simply providing speech-to-text transcription was insufficient for pronunciation learning. While recognition accuracy is important, learners need clear indications of "where the errors are." Therefore, I began to rethink the project's core objectives, gradually shifting the system from a "speech recognition tool" to a "pronunciation feedback system." Future development will include deeper syllable comparison analysis and error highlighting mechanisms to enhance its educational value.</w:t>
+      </w:r>
+    </w:p>
+    <w:p>
+      <w:pPr>
+        <w:rPr>
+          <w:rFonts w:ascii="Arial" w:hAnsi="Arial" w:cs="Arial"/>
+          <w:sz w:val="22"/>
+          <w:szCs w:val="22"/>
+          <w:lang w:eastAsia="zh-CN"/>
+        </w:rPr>
+      </w:pPr>
+      <w:r>
+        <w:rPr>
+          <w:rFonts w:ascii="Arial" w:hAnsi="Arial" w:cs="Arial"/>
+          <w:sz w:val="22"/>
+          <w:szCs w:val="22"/>
+          <w:lang w:eastAsia="zh-CN"/>
+        </w:rPr>
+        <w:t>Furthermore, significant stability differences were observed between different devices during GPU acceleration testing. While enabling the GPU significantly improves inference speed, it can cause operational anomalies in certain environments. Therefore, I adjusted the system architecture to make key parameters configurable, thereby improving the system's adaptability and compatibility.</w:t>
+      </w:r>
+    </w:p>
+    <w:p>
+      <w:pPr>
+        <w:rPr>
+          <w:rFonts w:ascii="Arial" w:hAnsi="Arial" w:cs="Arial"/>
+          <w:sz w:val="22"/>
+          <w:szCs w:val="22"/>
+          <w:lang w:eastAsia="zh-CN"/>
+        </w:rPr>
+      </w:pPr>
+      <w:r>
+        <w:rPr>
+          <w:rFonts w:ascii="Arial" w:hAnsi="Arial" w:cs="Arial"/>
+          <w:sz w:val="22"/>
+          <w:szCs w:val="22"/>
+          <w:lang w:eastAsia="zh-CN"/>
+        </w:rPr>
+        <w:t>Overall, this phase of practice not only improved the system's completeness but also deepened my understanding of the following issues:</w:t>
+      </w:r>
+    </w:p>
+    <w:p>
+      <w:pPr>
+        <w:rPr>
+          <w:rFonts w:ascii="Arial" w:hAnsi="Arial" w:cs="Arial"/>
+          <w:sz w:val="22"/>
+          <w:szCs w:val="22"/>
+          <w:lang w:eastAsia="zh-CN"/>
+        </w:rPr>
+      </w:pPr>
+      <w:r>
+        <w:rPr>
+          <w:rFonts w:ascii="Arial" w:hAnsi="Arial" w:cs="Arial" w:hint="eastAsia"/>
+          <w:sz w:val="22"/>
+          <w:szCs w:val="22"/>
+          <w:lang w:eastAsia="zh-CN"/>
+        </w:rPr>
+        <w:t>•</w:t>
+      </w:r>
+      <w:r>
+        <w:rPr>
+          <w:rFonts w:ascii="Arial" w:hAnsi="Arial" w:cs="Arial"/>
+          <w:sz w:val="22"/>
+          <w:szCs w:val="22"/>
+          <w:lang w:eastAsia="zh-CN"/>
+        </w:rPr>
+        <w:t xml:space="preserve"> The practical challenges of deploying large offline models</w:t>
+      </w:r>
+    </w:p>
+    <w:p>
+      <w:pPr>
+        <w:rPr>
+          <w:rFonts w:ascii="Arial" w:hAnsi="Arial" w:cs="Arial"/>
+          <w:sz w:val="22"/>
+          <w:szCs w:val="22"/>
+          <w:lang w:eastAsia="zh-CN"/>
+        </w:rPr>
+      </w:pPr>
+      <w:r>
+        <w:rPr>
+          <w:rFonts w:ascii="Arial" w:hAnsi="Arial" w:cs="Arial" w:hint="eastAsia"/>
+          <w:sz w:val="22"/>
+          <w:szCs w:val="22"/>
+          <w:lang w:eastAsia="zh-CN"/>
+        </w:rPr>
+        <w:t>•</w:t>
+      </w:r>
+      <w:r>
+        <w:rPr>
+          <w:rFonts w:ascii="Arial" w:hAnsi="Arial" w:cs="Arial"/>
+          <w:sz w:val="22"/>
+          <w:szCs w:val="22"/>
+          <w:lang w:eastAsia="zh-CN"/>
+        </w:rPr>
+        <w:t xml:space="preserve"> Performance trade-offs in real-time inference systems</w:t>
+      </w:r>
+    </w:p>
+    <w:p>
+      <w:pPr>
+        <w:rPr>
+          <w:rFonts w:ascii="Arial" w:hAnsi="Arial" w:cs="Arial"/>
+          <w:sz w:val="22"/>
+          <w:szCs w:val="22"/>
+          <w:lang w:eastAsia="zh-CN"/>
+        </w:rPr>
+      </w:pPr>
+      <w:r>
+        <w:rPr>
+          <w:rFonts w:ascii="Arial" w:hAnsi="Arial" w:cs="Arial" w:hint="eastAsia"/>
+          <w:sz w:val="22"/>
+          <w:szCs w:val="22"/>
+          <w:lang w:eastAsia="zh-CN"/>
+        </w:rPr>
+        <w:lastRenderedPageBreak/>
+        <w:t>•</w:t>
+      </w:r>
+      <w:r>
+        <w:rPr>
+          <w:rFonts w:ascii="Arial" w:hAnsi="Arial" w:cs="Arial"/>
+          <w:sz w:val="22"/>
+          <w:szCs w:val="22"/>
+          <w:lang w:eastAsia="zh-CN"/>
+        </w:rPr>
+        <w:t xml:space="preserve"> The gap between technical functionality and educational value. The project has gradually shifted from the "technical implementation" phase to the "educational application design" phase, and the research direction has become clearer.</w:t>
+      </w:r>
+    </w:p>
+    <w:p>
+      <w:pPr>
+        <w:rPr>
+          <w:rFonts w:ascii="Arial" w:hAnsi="Arial" w:cs="Arial"/>
+          <w:sz w:val="22"/>
+          <w:szCs w:val="22"/>
+          <w:lang w:eastAsia="zh-CN"/>
+        </w:rPr>
+      </w:pPr>
+      <w:r>
+        <w:rPr>
+          <w:rFonts w:ascii="Arial" w:hAnsi="Arial" w:cs="Arial"/>
+          <w:sz w:val="22"/>
+          <w:szCs w:val="22"/>
+          <w:lang w:eastAsia="zh-CN"/>
+        </w:rPr>
+        <w:t>Additionally, I also considered adding some gamification elements, specifically whether to include a very simple mini-game played using basic functions like pronunciation. The specifics still require further development, but the technical aspects are relatively simple.</w:t>
+      </w:r>
+    </w:p>
+    <w:p>
+      <w:pPr>
         <w:rPr>
           <w:rFonts w:ascii="Arial" w:hAnsi="Arial" w:cs="Arial"/>
           <w:b/>
@@ -1014,147 +1486,8 @@
           <w:sz w:val="22"/>
           <w:szCs w:val="22"/>
         </w:rPr>
-        <w:t>2.2 Analysis and Reflection</w:t>
-      </w:r>
-    </w:p>
-    <w:p>
-      <w:pPr>
-        <w:rPr>
-          <w:rFonts w:ascii="Arial" w:hAnsi="Arial" w:cs="Arial"/>
-          <w:sz w:val="22"/>
-          <w:szCs w:val="22"/>
-        </w:rPr>
-      </w:pPr>
-      <w:r>
-        <w:rPr>
-          <w:rFonts w:ascii="Arial" w:hAnsi="Arial" w:cs="Arial"/>
-          <w:sz w:val="22"/>
-          <w:szCs w:val="22"/>
-        </w:rPr>
-        <w:t>This is where you analyse its significance and show how your understanding has developed. Address the following points:</w:t>
-      </w:r>
-    </w:p>
-    <w:p>
-      <w:pPr>
-        <w:pStyle w:val="a9"/>
-        <w:numPr>
-          <w:ilvl w:val="0"/>
-          <w:numId w:val="23"/>
-        </w:numPr>
-        <w:rPr>
-          <w:rFonts w:ascii="Arial" w:hAnsi="Arial" w:cs="Arial"/>
-          <w:sz w:val="22"/>
-          <w:szCs w:val="22"/>
-        </w:rPr>
-      </w:pPr>
-      <w:r>
-        <w:rPr>
-          <w:rFonts w:ascii="Arial" w:hAnsi="Arial" w:cs="Arial"/>
-          <w:sz w:val="22"/>
-          <w:szCs w:val="22"/>
-        </w:rPr>
-        <w:t xml:space="preserve">What are your current findings, designs, or developments? What key insights have you gained from your initial testing or analysis? </w:t>
-      </w:r>
-    </w:p>
-    <w:p>
-      <w:pPr>
-        <w:pStyle w:val="a9"/>
-        <w:numPr>
-          <w:ilvl w:val="0"/>
-          <w:numId w:val="23"/>
-        </w:numPr>
-        <w:rPr>
-          <w:rFonts w:ascii="Arial" w:hAnsi="Arial" w:cs="Arial"/>
-          <w:sz w:val="22"/>
-          <w:szCs w:val="22"/>
-        </w:rPr>
-      </w:pPr>
-      <w:r>
-        <w:rPr>
-          <w:rFonts w:ascii="Arial" w:hAnsi="Arial" w:cs="Arial"/>
-          <w:sz w:val="22"/>
-          <w:szCs w:val="22"/>
-        </w:rPr>
-        <w:t>What are the potential implications of these results? Do they support your original assumptions, or have they led to a new and unexpected direction?</w:t>
-      </w:r>
-    </w:p>
-    <w:p>
-      <w:pPr>
-        <w:pStyle w:val="a9"/>
-        <w:numPr>
-          <w:ilvl w:val="0"/>
-          <w:numId w:val="23"/>
-        </w:numPr>
-        <w:rPr>
-          <w:rFonts w:ascii="Arial" w:hAnsi="Arial" w:cs="Arial"/>
-          <w:sz w:val="22"/>
-          <w:szCs w:val="22"/>
-        </w:rPr>
-      </w:pPr>
-      <w:r>
-        <w:rPr>
-          <w:rFonts w:ascii="Arial" w:hAnsi="Arial" w:cs="Arial"/>
-          <w:sz w:val="22"/>
-          <w:szCs w:val="22"/>
-        </w:rPr>
-        <w:t>How does the progress on your artefact directly address the original problem statement you outlined in your proposal?</w:t>
-      </w:r>
-    </w:p>
-    <w:p>
-      <w:pPr>
-        <w:pStyle w:val="a9"/>
-        <w:numPr>
-          <w:ilvl w:val="0"/>
-          <w:numId w:val="23"/>
-        </w:numPr>
-        <w:rPr>
-          <w:rFonts w:ascii="Arial" w:hAnsi="Arial" w:cs="Arial"/>
-          <w:sz w:val="22"/>
-          <w:szCs w:val="22"/>
-        </w:rPr>
-      </w:pPr>
-      <w:r>
-        <w:rPr>
-          <w:rFonts w:ascii="Arial" w:hAnsi="Arial" w:cs="Arial"/>
-          <w:sz w:val="22"/>
-          <w:szCs w:val="22"/>
-        </w:rPr>
-        <w:t>In what ways has your practical work altered or enhanced your understanding of the project's topic?</w:t>
-      </w:r>
-    </w:p>
-    <w:p>
-      <w:pPr>
-        <w:pStyle w:val="a9"/>
-        <w:numPr>
-          <w:ilvl w:val="0"/>
-          <w:numId w:val="23"/>
-        </w:numPr>
-        <w:rPr>
-          <w:rFonts w:ascii="Arial" w:hAnsi="Arial" w:cs="Arial"/>
-          <w:sz w:val="22"/>
-          <w:szCs w:val="22"/>
-        </w:rPr>
-      </w:pPr>
-      <w:r>
-        <w:rPr>
-          <w:rFonts w:ascii="Arial" w:hAnsi="Arial" w:cs="Arial"/>
-          <w:sz w:val="22"/>
-          <w:szCs w:val="22"/>
-        </w:rPr>
-        <w:t>Describe a specific instance where you needed to revise your approach or design based on what you discovered during development or experimentation. This demonstrates critical thinking and adaptability.</w:t>
-      </w:r>
-    </w:p>
-    <w:p>
-      <w:pPr>
-        <w:rPr>
-          <w:rFonts w:ascii="Arial" w:hAnsi="Arial" w:cs="Arial"/>
-          <w:sz w:val="22"/>
-          <w:szCs w:val="22"/>
-        </w:rPr>
-      </w:pPr>
-    </w:p>
-    <w:p>
-      <w:pPr>
+      </w:pPr>
+      <w:r>
         <w:rPr>
           <w:rFonts w:ascii="Arial" w:hAnsi="Arial" w:cs="Arial"/>
           <w:b/>
@@ -1162,186 +1495,453 @@
           <w:sz w:val="22"/>
           <w:szCs w:val="22"/>
         </w:rPr>
-      </w:pPr>
-      <w:r>
+        <w:t>3.0 Updated Planning for Project Completion</w:t>
+      </w:r>
+    </w:p>
+    <w:p>
+      <w:pPr>
         <w:rPr>
           <w:rFonts w:ascii="Arial" w:hAnsi="Arial" w:cs="Arial"/>
           <w:b/>
           <w:bCs/>
           <w:sz w:val="22"/>
           <w:szCs w:val="22"/>
-        </w:rPr>
-        <w:lastRenderedPageBreak/>
-        <w:t>3.0 Updated Planning for Project Completion</w:t>
-      </w:r>
-    </w:p>
-    <w:p>
-      <w:pPr>
-        <w:rPr>
-          <w:rFonts w:ascii="Arial" w:hAnsi="Arial" w:cs="Arial"/>
-          <w:sz w:val="22"/>
-          <w:szCs w:val="22"/>
-        </w:rPr>
-      </w:pPr>
-      <w:r>
-        <w:rPr>
-          <w:rFonts w:ascii="Arial" w:hAnsi="Arial" w:cs="Arial"/>
-          <w:sz w:val="22"/>
-          <w:szCs w:val="22"/>
-        </w:rPr>
-        <w:t>This section showcases your forward-thinking and project management skills, setting out a clear and achievable plan to complete the project on time</w:t>
-      </w:r>
-      <w:r>
-        <w:rPr>
-          <w:rFonts w:ascii="Arial" w:hAnsi="Arial" w:cs="Arial"/>
-          <w:sz w:val="22"/>
-          <w:szCs w:val="22"/>
-        </w:rPr>
-        <w:t>.</w:t>
-      </w:r>
-    </w:p>
-    <w:p>
-      <w:pPr>
-        <w:rPr>
-          <w:rFonts w:ascii="Arial" w:hAnsi="Arial" w:cs="Arial"/>
-          <w:sz w:val="22"/>
-          <w:szCs w:val="22"/>
-        </w:rPr>
-      </w:pPr>
-      <w:r>
-        <w:rPr>
-          <w:rFonts w:ascii="Arial" w:hAnsi="Arial" w:cs="Arial"/>
-          <w:sz w:val="22"/>
-          <w:szCs w:val="22"/>
-        </w:rPr>
-        <w:t>List the primary, high-priority tasks you must complete to finalise the project</w:t>
-      </w:r>
-      <w:r>
-        <w:rPr>
-          <w:rFonts w:ascii="Arial" w:hAnsi="Arial" w:cs="Arial"/>
-          <w:sz w:val="22"/>
-          <w:szCs w:val="22"/>
-        </w:rPr>
-        <w:t xml:space="preserve"> and be prepared to defend</w:t>
-      </w:r>
-      <w:r>
-        <w:rPr>
-          <w:rFonts w:ascii="Arial" w:hAnsi="Arial" w:cs="Arial"/>
-          <w:sz w:val="22"/>
-          <w:szCs w:val="22"/>
-        </w:rPr>
-        <w:t xml:space="preserve"> the priority of these tasks</w:t>
-      </w:r>
-      <w:r>
-        <w:rPr>
-          <w:rFonts w:ascii="Arial" w:hAnsi="Arial" w:cs="Arial"/>
-          <w:sz w:val="22"/>
-          <w:szCs w:val="22"/>
-        </w:rPr>
-        <w:t>.</w:t>
-      </w:r>
-      <w:r>
-        <w:rPr>
-          <w:rFonts w:ascii="Arial" w:hAnsi="Arial" w:cs="Arial"/>
-          <w:sz w:val="22"/>
-          <w:szCs w:val="22"/>
-        </w:rPr>
-        <w:t xml:space="preserve"> For example</w:t>
-      </w:r>
-      <w:r>
-        <w:rPr>
-          <w:rFonts w:ascii="Arial" w:hAnsi="Arial" w:cs="Arial"/>
-          <w:sz w:val="22"/>
-          <w:szCs w:val="22"/>
-        </w:rPr>
-        <w:t>, this can include</w:t>
-      </w:r>
-      <w:r>
-        <w:rPr>
-          <w:rFonts w:ascii="Arial" w:hAnsi="Arial" w:cs="Arial"/>
-          <w:sz w:val="22"/>
-          <w:szCs w:val="22"/>
-        </w:rPr>
-        <w:t xml:space="preserve">: </w:t>
-      </w:r>
-    </w:p>
-    <w:p>
-      <w:pPr>
-        <w:pStyle w:val="a9"/>
-        <w:numPr>
-          <w:ilvl w:val="0"/>
-          <w:numId w:val="22"/>
-        </w:numPr>
-        <w:rPr>
-          <w:rFonts w:ascii="Arial" w:hAnsi="Arial" w:cs="Arial"/>
-          <w:sz w:val="22"/>
-          <w:szCs w:val="22"/>
-        </w:rPr>
-      </w:pPr>
-      <w:r>
-        <w:rPr>
-          <w:rFonts w:ascii="Arial" w:hAnsi="Arial" w:cs="Arial"/>
-          <w:sz w:val="22"/>
-          <w:szCs w:val="22"/>
-        </w:rPr>
-        <w:t>Complete the final phase of user acceptance testing (UAT) with ten users.</w:t>
-      </w:r>
-    </w:p>
-    <w:p>
-      <w:pPr>
-        <w:pStyle w:val="a9"/>
-        <w:numPr>
-          <w:ilvl w:val="0"/>
-          <w:numId w:val="22"/>
-        </w:numPr>
-        <w:rPr>
-          <w:rFonts w:ascii="Arial" w:hAnsi="Arial" w:cs="Arial"/>
-          <w:sz w:val="22"/>
-          <w:szCs w:val="22"/>
-        </w:rPr>
-      </w:pPr>
-      <w:r>
-        <w:rPr>
-          <w:rFonts w:ascii="Arial" w:hAnsi="Arial" w:cs="Arial"/>
-          <w:sz w:val="22"/>
-          <w:szCs w:val="22"/>
-        </w:rPr>
-        <w:t>Analyse and visualise the final dataset for the Results chapter.</w:t>
-      </w:r>
-    </w:p>
-    <w:p>
-      <w:pPr>
-        <w:pStyle w:val="a9"/>
-        <w:numPr>
-          <w:ilvl w:val="0"/>
-          <w:numId w:val="22"/>
-        </w:numPr>
-        <w:rPr>
-          <w:rFonts w:ascii="Arial" w:hAnsi="Arial" w:cs="Arial"/>
-          <w:sz w:val="22"/>
-          <w:szCs w:val="22"/>
-        </w:rPr>
-      </w:pPr>
-      <w:r>
-        <w:rPr>
-          <w:rFonts w:ascii="Arial" w:hAnsi="Arial" w:cs="Arial"/>
-          <w:sz w:val="22"/>
-          <w:szCs w:val="22"/>
-        </w:rPr>
-        <w:t>Draft the Discussion and Conclusion chapters of the final report.</w:t>
-      </w:r>
-    </w:p>
-    <w:p>
-      <w:pPr>
+          <w:lang w:eastAsia="zh-CN"/>
+        </w:rPr>
+      </w:pPr>
+      <w:r>
         <w:rPr>
           <w:rFonts w:ascii="Arial" w:hAnsi="Arial" w:cs="Arial"/>
           <w:b/>
           <w:bCs/>
-          <w:sz w:val="22"/>
-          <w:szCs w:val="22"/>
-        </w:rPr>
-      </w:pPr>
-      <w:r>
+          <w:noProof/>
+          <w:sz w:val="22"/>
+          <w:szCs w:val="22"/>
+          <w:lang w:eastAsia="zh-CN"/>
+        </w:rPr>
+        <w:drawing>
+          <wp:inline distT="0" distB="0" distL="0" distR="0" wp14:anchorId="32D313E6" wp14:editId="3B48B603">
+            <wp:extent cx="5474970" cy="1688465"/>
+            <wp:effectExtent l="0" t="0" r="0" b="6985"/>
+            <wp:docPr id="1152140677" name="图片 3"/>
+            <wp:cNvGraphicFramePr>
+              <a:graphicFrameLocks xmlns:a="http://schemas.openxmlformats.org/drawingml/2006/main" noChangeAspect="1"/>
+            </wp:cNvGraphicFramePr>
+            <a:graphic xmlns:a="http://schemas.openxmlformats.org/drawingml/2006/main">
+              <a:graphicData uri="http://schemas.openxmlformats.org/drawingml/2006/picture">
+                <pic:pic xmlns:pic="http://schemas.openxmlformats.org/drawingml/2006/picture">
+                  <pic:nvPicPr>
+                    <pic:cNvPr id="0" name="Picture 2"/>
+                    <pic:cNvPicPr>
+                      <a:picLocks noChangeAspect="1" noChangeArrowheads="1"/>
+                    </pic:cNvPicPr>
+                  </pic:nvPicPr>
+                  <pic:blipFill>
+                    <a:blip r:embed="rId8">
+                      <a:extLst>
+                        <a:ext uri="{28A0092B-C50C-407E-A947-70E740481C1C}">
+                          <a14:useLocalDpi xmlns:a14="http://schemas.microsoft.com/office/drawing/2010/main" val="0"/>
+                        </a:ext>
+                      </a:extLst>
+                    </a:blip>
+                    <a:srcRect/>
+                    <a:stretch>
+                      <a:fillRect/>
+                    </a:stretch>
+                  </pic:blipFill>
+                  <pic:spPr bwMode="auto">
+                    <a:xfrm>
+                      <a:off x="0" y="0"/>
+                      <a:ext cx="5474970" cy="1688465"/>
+                    </a:xfrm>
+                    <a:prstGeom prst="rect">
+                      <a:avLst/>
+                    </a:prstGeom>
+                    <a:noFill/>
+                  </pic:spPr>
+                </pic:pic>
+              </a:graphicData>
+            </a:graphic>
+          </wp:inline>
+        </w:drawing>
+      </w:r>
+    </w:p>
+    <w:p>
+      <w:pPr>
+        <w:pStyle w:val="af5"/>
+        <w:rPr>
+          <w:lang w:eastAsia="zh-CN"/>
+        </w:rPr>
+      </w:pPr>
+      <w:r>
+        <w:t xml:space="preserve">Figure </w:t>
+      </w:r>
+      <w:fldSimple w:instr=" SEQ Figure \* ARABIC ">
+        <w:r>
+          <w:rPr>
+            <w:noProof/>
+          </w:rPr>
+          <w:t>1</w:t>
+        </w:r>
+      </w:fldSimple>
+      <w:r>
+        <w:rPr>
+          <w:rFonts w:hint="eastAsia"/>
+          <w:lang w:eastAsia="zh-CN"/>
+        </w:rPr>
+        <w:t>: The gant table for this project.</w:t>
+      </w:r>
+    </w:p>
+    <w:p>
+      <w:pPr>
+        <w:rPr>
+          <w:lang w:eastAsia="zh-CN"/>
+        </w:rPr>
+      </w:pPr>
+      <w:r>
+        <w:rPr>
+          <w:noProof/>
+        </w:rPr>
+        <w:drawing>
+          <wp:inline distT="0" distB="0" distL="0" distR="0" wp14:anchorId="7A1A03CF" wp14:editId="53A79443">
+            <wp:extent cx="5474335" cy="3625215"/>
+            <wp:effectExtent l="0" t="0" r="0" b="0"/>
+            <wp:docPr id="1671050909" name="图片 1" descr="文本&#10;&#10;AI 生成的内容可能不正确。"/>
+            <wp:cNvGraphicFramePr>
+              <a:graphicFrameLocks xmlns:a="http://schemas.openxmlformats.org/drawingml/2006/main" noChangeAspect="1"/>
+            </wp:cNvGraphicFramePr>
+            <a:graphic xmlns:a="http://schemas.openxmlformats.org/drawingml/2006/main">
+              <a:graphicData uri="http://schemas.openxmlformats.org/drawingml/2006/picture">
+                <pic:pic xmlns:pic="http://schemas.openxmlformats.org/drawingml/2006/picture">
+                  <pic:nvPicPr>
+                    <pic:cNvPr id="1671050909" name="图片 1" descr="文本&#10;&#10;AI 生成的内容可能不正确。"/>
+                    <pic:cNvPicPr/>
+                  </pic:nvPicPr>
+                  <pic:blipFill>
+                    <a:blip r:embed="rId9"/>
+                    <a:stretch>
+                      <a:fillRect/>
+                    </a:stretch>
+                  </pic:blipFill>
+                  <pic:spPr>
+                    <a:xfrm>
+                      <a:off x="0" y="0"/>
+                      <a:ext cx="5474335" cy="3625215"/>
+                    </a:xfrm>
+                    <a:prstGeom prst="rect">
+                      <a:avLst/>
+                    </a:prstGeom>
+                  </pic:spPr>
+                </pic:pic>
+              </a:graphicData>
+            </a:graphic>
+          </wp:inline>
+        </w:drawing>
+      </w:r>
+    </w:p>
+    <w:p>
+      <w:pPr>
+        <w:pStyle w:val="af5"/>
+        <w:rPr>
+          <w:lang w:val="en-US" w:eastAsia="zh-CN"/>
+        </w:rPr>
+      </w:pPr>
+      <w:r>
+        <w:t xml:space="preserve">Figure </w:t>
+      </w:r>
+      <w:fldSimple w:instr=" SEQ Figure \* ARABIC ">
+        <w:r>
+          <w:rPr>
+            <w:noProof/>
+          </w:rPr>
+          <w:t>2</w:t>
+        </w:r>
+      </w:fldSimple>
+      <w:r>
+        <w:rPr>
+          <w:rFonts w:hint="eastAsia"/>
+          <w:lang w:eastAsia="zh-CN"/>
+        </w:rPr>
+        <w:t>: The Main UI of application.</w:t>
+      </w:r>
+    </w:p>
+    <w:p>
+      <w:pPr>
+        <w:rPr>
+          <w:lang w:val="en-US" w:eastAsia="zh-CN"/>
+        </w:rPr>
+      </w:pPr>
+      <w:r>
+        <w:rPr>
+          <w:noProof/>
+        </w:rPr>
+        <w:lastRenderedPageBreak/>
+        <w:drawing>
+          <wp:inline distT="0" distB="0" distL="0" distR="0" wp14:anchorId="574853BB" wp14:editId="1D6BEE80">
+            <wp:extent cx="5474335" cy="2939415"/>
+            <wp:effectExtent l="0" t="0" r="0" b="0"/>
+            <wp:docPr id="1600462432" name="图片 1" descr="电子设备的屏幕截图&#10;&#10;AI 生成的内容可能不正确。"/>
+            <wp:cNvGraphicFramePr>
+              <a:graphicFrameLocks xmlns:a="http://schemas.openxmlformats.org/drawingml/2006/main" noChangeAspect="1"/>
+            </wp:cNvGraphicFramePr>
+            <a:graphic xmlns:a="http://schemas.openxmlformats.org/drawingml/2006/main">
+              <a:graphicData uri="http://schemas.openxmlformats.org/drawingml/2006/picture">
+                <pic:pic xmlns:pic="http://schemas.openxmlformats.org/drawingml/2006/picture">
+                  <pic:nvPicPr>
+                    <pic:cNvPr id="1600462432" name="图片 1" descr="电子设备的屏幕截图&#10;&#10;AI 生成的内容可能不正确。"/>
+                    <pic:cNvPicPr/>
+                  </pic:nvPicPr>
+                  <pic:blipFill>
+                    <a:blip r:embed="rId10"/>
+                    <a:stretch>
+                      <a:fillRect/>
+                    </a:stretch>
+                  </pic:blipFill>
+                  <pic:spPr>
+                    <a:xfrm>
+                      <a:off x="0" y="0"/>
+                      <a:ext cx="5474335" cy="2939415"/>
+                    </a:xfrm>
+                    <a:prstGeom prst="rect">
+                      <a:avLst/>
+                    </a:prstGeom>
+                  </pic:spPr>
+                </pic:pic>
+              </a:graphicData>
+            </a:graphic>
+          </wp:inline>
+        </w:drawing>
+      </w:r>
+    </w:p>
+    <w:p>
+      <w:pPr>
+        <w:pStyle w:val="af5"/>
+        <w:rPr>
+          <w:lang w:val="en-US" w:eastAsia="zh-CN"/>
+        </w:rPr>
+      </w:pPr>
+      <w:r>
+        <w:t xml:space="preserve">Figure </w:t>
+      </w:r>
+      <w:fldSimple w:instr=" SEQ Figure \* ARABIC ">
+        <w:r>
+          <w:rPr>
+            <w:noProof/>
+          </w:rPr>
+          <w:t>3</w:t>
+        </w:r>
+      </w:fldSimple>
+      <w:r>
+        <w:t>: The core UI script of application.</w:t>
+      </w:r>
+    </w:p>
+    <w:p>
+      <w:pPr>
+        <w:rPr>
+          <w:lang w:eastAsia="zh-CN"/>
+        </w:rPr>
+      </w:pPr>
+      <w:r>
+        <w:rPr>
+          <w:lang w:eastAsia="zh-CN"/>
+        </w:rPr>
+        <w:t>To ensure the project is completed on time and to a high standard, the following tasks will be prioritized:</w:t>
+      </w:r>
+    </w:p>
+    <w:p>
+      <w:pPr>
+        <w:rPr>
+          <w:lang w:eastAsia="zh-CN"/>
+        </w:rPr>
+      </w:pPr>
+    </w:p>
+    <w:p>
+      <w:pPr>
+        <w:rPr>
+          <w:lang w:eastAsia="zh-CN"/>
+        </w:rPr>
+      </w:pPr>
+      <w:r>
+        <w:rPr>
+          <w:rFonts w:hint="eastAsia"/>
+          <w:lang w:eastAsia="zh-CN"/>
+        </w:rPr>
+        <w:t>1.</w:t>
+      </w:r>
+      <w:r>
+        <w:rPr>
+          <w:lang w:eastAsia="zh-CN"/>
+        </w:rPr>
+        <w:t>evelopment of a pronunciation feedback mechanism: Design a phoneme comparison algorithm or similarity scoring system to convert the transcription results into structured feedback information.</w:t>
+      </w:r>
+    </w:p>
+    <w:p>
+      <w:pPr>
+        <w:rPr>
+          <w:lang w:eastAsia="zh-CN"/>
+        </w:rPr>
+      </w:pPr>
+      <w:r>
+        <w:rPr>
+          <w:lang w:eastAsia="zh-CN"/>
+        </w:rPr>
+        <w:t>2</w:t>
+      </w:r>
+      <w:r>
+        <w:rPr>
+          <w:rFonts w:hint="eastAsia"/>
+          <w:lang w:eastAsia="zh-CN"/>
+        </w:rPr>
+        <w:t>.</w:t>
+      </w:r>
+      <w:r>
+        <w:rPr>
+          <w:lang w:eastAsia="zh-CN"/>
+        </w:rPr>
+        <w:t>Performance optimization and stress testing: Conduct performance benchmark tests under different hardware conditions to optimize inference speed and stability.</w:t>
+      </w:r>
+    </w:p>
+    <w:p>
+      <w:pPr>
+        <w:rPr>
+          <w:lang w:eastAsia="zh-CN"/>
+        </w:rPr>
+      </w:pPr>
+      <w:r>
+        <w:rPr>
+          <w:lang w:eastAsia="zh-CN"/>
+        </w:rPr>
+        <w:t>3</w:t>
+      </w:r>
+      <w:r>
+        <w:rPr>
+          <w:rFonts w:hint="eastAsia"/>
+          <w:lang w:eastAsia="zh-CN"/>
+        </w:rPr>
+        <w:t>.</w:t>
+      </w:r>
+      <w:r>
+        <w:rPr>
+          <w:lang w:eastAsia="zh-CN"/>
+        </w:rPr>
+        <w:t>ser testing: Invite 5–10 test users to conduct functional and usability tests and collect feedback data.</w:t>
+      </w:r>
+    </w:p>
+    <w:p>
+      <w:pPr>
+        <w:rPr>
+          <w:lang w:eastAsia="zh-CN"/>
+        </w:rPr>
+      </w:pPr>
+      <w:r>
+        <w:rPr>
+          <w:rFonts w:hint="eastAsia"/>
+          <w:lang w:eastAsia="zh-CN"/>
+        </w:rPr>
+        <w:t>4.</w:t>
+      </w:r>
+      <w:r>
+        <w:rPr>
+          <w:lang w:eastAsia="zh-CN"/>
+        </w:rPr>
+        <w:t>per writing:</w:t>
+      </w:r>
+    </w:p>
+    <w:p>
+      <w:pPr>
+        <w:rPr>
+          <w:lang w:eastAsia="zh-CN"/>
+        </w:rPr>
+      </w:pPr>
+      <w:r>
+        <w:rPr>
+          <w:rFonts w:hint="eastAsia"/>
+          <w:lang w:eastAsia="zh-CN"/>
+        </w:rPr>
+        <w:t>•</w:t>
+      </w:r>
+      <w:r>
+        <w:rPr>
+          <w:lang w:eastAsia="zh-CN"/>
+        </w:rPr>
+        <w:t xml:space="preserve"> Complete the methodology chapter</w:t>
+      </w:r>
+    </w:p>
+    <w:p>
+      <w:pPr>
+        <w:rPr>
+          <w:lang w:eastAsia="zh-CN"/>
+        </w:rPr>
+      </w:pPr>
+      <w:r>
+        <w:rPr>
+          <w:rFonts w:hint="eastAsia"/>
+          <w:lang w:eastAsia="zh-CN"/>
+        </w:rPr>
+        <w:t>•</w:t>
+      </w:r>
+      <w:r>
+        <w:rPr>
+          <w:lang w:eastAsia="zh-CN"/>
+        </w:rPr>
+        <w:t xml:space="preserve"> Write the results analysis</w:t>
+      </w:r>
+    </w:p>
+    <w:p>
+      <w:pPr>
+        <w:rPr>
+          <w:lang w:eastAsia="zh-CN"/>
+        </w:rPr>
+      </w:pPr>
+      <w:r>
+        <w:rPr>
+          <w:rFonts w:hint="eastAsia"/>
+          <w:lang w:eastAsia="zh-CN"/>
+        </w:rPr>
+        <w:t>•</w:t>
+      </w:r>
+      <w:r>
+        <w:rPr>
+          <w:lang w:eastAsia="zh-CN"/>
+        </w:rPr>
+        <w:t xml:space="preserve"> Complete the discussion and conclusion section</w:t>
+      </w:r>
+    </w:p>
+    <w:p>
+      <w:pPr>
+        <w:rPr>
+          <w:lang w:eastAsia="zh-CN"/>
+        </w:rPr>
+      </w:pPr>
+      <w:r>
+        <w:rPr>
+          <w:rFonts w:hint="eastAsia"/>
+          <w:lang w:eastAsia="zh-CN"/>
+        </w:rPr>
+        <w:t>•</w:t>
+      </w:r>
+      <w:r>
+        <w:rPr>
+          <w:lang w:eastAsia="zh-CN"/>
+        </w:rPr>
+        <w:t xml:space="preserve"> Supplement system limitations and future improvement directions</w:t>
+      </w:r>
+    </w:p>
+    <w:p>
+      <w:pPr>
+        <w:rPr>
+          <w:lang w:eastAsia="zh-CN"/>
+        </w:rPr>
+      </w:pPr>
+      <w:r>
+        <w:rPr>
+          <w:lang w:eastAsia="zh-CN"/>
+        </w:rPr>
+        <w:t>Priority explanation: The pronunciation feedback mechanism is the core value of the project. If this function cannot be implemented, the system will only remain at the speech transcription level. Therefore, this part is the highest priority task.</w:t>
+      </w:r>
+    </w:p>
+    <w:p>
+      <w:pPr>
         <w:rPr>
           <w:rFonts w:ascii="Arial" w:hAnsi="Arial" w:cs="Arial"/>
           <w:b/>
@@ -1349,6 +1949,16 @@
           <w:sz w:val="22"/>
           <w:szCs w:val="22"/>
         </w:rPr>
+      </w:pPr>
+      <w:r>
+        <w:rPr>
+          <w:rFonts w:ascii="Arial" w:hAnsi="Arial" w:cs="Arial"/>
+          <w:b/>
+          <w:bCs/>
+          <w:sz w:val="22"/>
+          <w:szCs w:val="22"/>
+        </w:rPr>
+        <w:lastRenderedPageBreak/>
         <w:t>3.2 Draft Outline of Final Report</w:t>
       </w:r>
     </w:p>
@@ -1358,19 +1968,728 @@
           <w:rFonts w:ascii="Arial" w:hAnsi="Arial" w:cs="Arial"/>
           <w:sz w:val="22"/>
           <w:szCs w:val="22"/>
-        </w:rPr>
-      </w:pPr>
-      <w:r>
-        <w:rPr>
-          <w:rFonts w:ascii="Arial" w:hAnsi="Arial" w:cs="Arial"/>
-          <w:sz w:val="22"/>
-          <w:szCs w:val="22"/>
-        </w:rPr>
-        <w:t>Provide a structured plan for your dissertation or final report. The chapter titles and points should be tailored to your project and demonstrate a thorough grasp of your work, steering clear of generic headings. You can also draw on headings from your revised interim project report.</w:t>
+          <w:lang w:eastAsia="zh-CN"/>
+        </w:rPr>
+      </w:pPr>
+      <w:r>
+        <w:rPr>
+          <w:rFonts w:ascii="Arial" w:hAnsi="Arial" w:cs="Arial"/>
+          <w:sz w:val="22"/>
+          <w:szCs w:val="22"/>
+          <w:lang w:eastAsia="zh-CN"/>
+        </w:rPr>
+        <w:t>Chapter 1 Introduction</w:t>
+      </w:r>
+    </w:p>
+    <w:p>
+      <w:pPr>
+        <w:rPr>
+          <w:rFonts w:ascii="Arial" w:hAnsi="Arial" w:cs="Arial"/>
+          <w:sz w:val="22"/>
+          <w:szCs w:val="22"/>
+          <w:lang w:eastAsia="zh-CN"/>
+        </w:rPr>
+      </w:pPr>
+      <w:r>
+        <w:rPr>
+          <w:rFonts w:ascii="Arial" w:hAnsi="Arial" w:cs="Arial" w:hint="eastAsia"/>
+          <w:sz w:val="22"/>
+          <w:szCs w:val="22"/>
+          <w:lang w:eastAsia="zh-CN"/>
+        </w:rPr>
+        <w:t>•</w:t>
+      </w:r>
+      <w:r>
+        <w:rPr>
+          <w:rFonts w:ascii="Arial" w:hAnsi="Arial" w:cs="Arial"/>
+          <w:sz w:val="22"/>
+          <w:szCs w:val="22"/>
+          <w:lang w:eastAsia="zh-CN"/>
+        </w:rPr>
+        <w:t xml:space="preserve"> Research Background</w:t>
+      </w:r>
+    </w:p>
+    <w:p>
+      <w:pPr>
+        <w:rPr>
+          <w:rFonts w:ascii="Arial" w:hAnsi="Arial" w:cs="Arial"/>
+          <w:sz w:val="22"/>
+          <w:szCs w:val="22"/>
+          <w:lang w:eastAsia="zh-CN"/>
+        </w:rPr>
+      </w:pPr>
+      <w:r>
+        <w:rPr>
+          <w:rFonts w:ascii="Arial" w:hAnsi="Arial" w:cs="Arial" w:hint="eastAsia"/>
+          <w:sz w:val="22"/>
+          <w:szCs w:val="22"/>
+          <w:lang w:eastAsia="zh-CN"/>
+        </w:rPr>
+        <w:t>•</w:t>
+      </w:r>
+      <w:r>
+        <w:rPr>
+          <w:rFonts w:ascii="Arial" w:hAnsi="Arial" w:cs="Arial"/>
+          <w:sz w:val="22"/>
+          <w:szCs w:val="22"/>
+          <w:lang w:eastAsia="zh-CN"/>
+        </w:rPr>
+        <w:t xml:space="preserve"> Research Questions and Objectives</w:t>
+      </w:r>
+    </w:p>
+    <w:p>
+      <w:pPr>
+        <w:rPr>
+          <w:rFonts w:ascii="Arial" w:hAnsi="Arial" w:cs="Arial"/>
+          <w:sz w:val="22"/>
+          <w:szCs w:val="22"/>
+          <w:lang w:eastAsia="zh-CN"/>
+        </w:rPr>
+      </w:pPr>
+      <w:r>
+        <w:rPr>
+          <w:rFonts w:ascii="Arial" w:hAnsi="Arial" w:cs="Arial" w:hint="eastAsia"/>
+          <w:sz w:val="22"/>
+          <w:szCs w:val="22"/>
+          <w:lang w:eastAsia="zh-CN"/>
+        </w:rPr>
+        <w:t>•</w:t>
+      </w:r>
+      <w:r>
+        <w:rPr>
+          <w:rFonts w:ascii="Arial" w:hAnsi="Arial" w:cs="Arial"/>
+          <w:sz w:val="22"/>
+          <w:szCs w:val="22"/>
+          <w:lang w:eastAsia="zh-CN"/>
+        </w:rPr>
+        <w:t xml:space="preserve"> Project Significance</w:t>
+      </w:r>
+    </w:p>
+    <w:p>
+      <w:pPr>
+        <w:rPr>
+          <w:rFonts w:ascii="Arial" w:hAnsi="Arial" w:cs="Arial"/>
+          <w:sz w:val="22"/>
+          <w:szCs w:val="22"/>
+          <w:lang w:eastAsia="zh-CN"/>
+        </w:rPr>
+      </w:pPr>
+    </w:p>
+    <w:p>
+      <w:pPr>
+        <w:rPr>
+          <w:rFonts w:ascii="Arial" w:hAnsi="Arial" w:cs="Arial"/>
+          <w:sz w:val="22"/>
+          <w:szCs w:val="22"/>
+          <w:lang w:eastAsia="zh-CN"/>
+        </w:rPr>
+      </w:pPr>
+      <w:r>
+        <w:rPr>
+          <w:rFonts w:ascii="Arial" w:hAnsi="Arial" w:cs="Arial"/>
+          <w:sz w:val="22"/>
+          <w:szCs w:val="22"/>
+          <w:lang w:eastAsia="zh-CN"/>
+        </w:rPr>
+        <w:t>Chapter 2 Literature Review</w:t>
+      </w:r>
+    </w:p>
+    <w:p>
+      <w:pPr>
+        <w:rPr>
+          <w:rFonts w:ascii="Arial" w:hAnsi="Arial" w:cs="Arial"/>
+          <w:sz w:val="22"/>
+          <w:szCs w:val="22"/>
+          <w:lang w:eastAsia="zh-CN"/>
+        </w:rPr>
+      </w:pPr>
+      <w:r>
+        <w:rPr>
+          <w:rFonts w:ascii="Arial" w:hAnsi="Arial" w:cs="Arial" w:hint="eastAsia"/>
+          <w:sz w:val="22"/>
+          <w:szCs w:val="22"/>
+          <w:lang w:eastAsia="zh-CN"/>
+        </w:rPr>
+        <w:t>•</w:t>
+      </w:r>
+      <w:r>
+        <w:rPr>
+          <w:rFonts w:ascii="Arial" w:hAnsi="Arial" w:cs="Arial"/>
+          <w:sz w:val="22"/>
+          <w:szCs w:val="22"/>
+          <w:lang w:eastAsia="zh-CN"/>
+        </w:rPr>
+        <w:t xml:space="preserve"> Transformer and Whisper Models</w:t>
+      </w:r>
+    </w:p>
+    <w:p>
+      <w:pPr>
+        <w:rPr>
+          <w:rFonts w:ascii="Arial" w:hAnsi="Arial" w:cs="Arial"/>
+          <w:sz w:val="22"/>
+          <w:szCs w:val="22"/>
+          <w:lang w:eastAsia="zh-CN"/>
+        </w:rPr>
+      </w:pPr>
+      <w:r>
+        <w:rPr>
+          <w:rFonts w:ascii="Arial" w:hAnsi="Arial" w:cs="Arial" w:hint="eastAsia"/>
+          <w:sz w:val="22"/>
+          <w:szCs w:val="22"/>
+          <w:lang w:eastAsia="zh-CN"/>
+        </w:rPr>
+        <w:t>•</w:t>
+      </w:r>
+      <w:r>
+        <w:rPr>
+          <w:rFonts w:ascii="Arial" w:hAnsi="Arial" w:cs="Arial"/>
+          <w:sz w:val="22"/>
+          <w:szCs w:val="22"/>
+          <w:lang w:eastAsia="zh-CN"/>
+        </w:rPr>
+        <w:t xml:space="preserve"> Computer-Aided Language Learning</w:t>
+      </w:r>
+    </w:p>
+    <w:p>
+      <w:pPr>
+        <w:rPr>
+          <w:rFonts w:ascii="Arial" w:hAnsi="Arial" w:cs="Arial"/>
+          <w:sz w:val="22"/>
+          <w:szCs w:val="22"/>
+          <w:lang w:eastAsia="zh-CN"/>
+        </w:rPr>
+      </w:pPr>
+      <w:r>
+        <w:rPr>
+          <w:rFonts w:ascii="Arial" w:hAnsi="Arial" w:cs="Arial" w:hint="eastAsia"/>
+          <w:sz w:val="22"/>
+          <w:szCs w:val="22"/>
+          <w:lang w:eastAsia="zh-CN"/>
+        </w:rPr>
+        <w:t>•</w:t>
+      </w:r>
+      <w:r>
+        <w:rPr>
+          <w:rFonts w:ascii="Arial" w:hAnsi="Arial" w:cs="Arial"/>
+          <w:sz w:val="22"/>
+          <w:szCs w:val="22"/>
+          <w:lang w:eastAsia="zh-CN"/>
+        </w:rPr>
+        <w:t xml:space="preserve"> Offline AI System Deployment Challenges</w:t>
+      </w:r>
+    </w:p>
+    <w:p>
+      <w:pPr>
+        <w:rPr>
+          <w:rFonts w:ascii="Arial" w:hAnsi="Arial" w:cs="Arial"/>
+          <w:sz w:val="22"/>
+          <w:szCs w:val="22"/>
+          <w:lang w:eastAsia="zh-CN"/>
+        </w:rPr>
+      </w:pPr>
+    </w:p>
+    <w:p>
+      <w:pPr>
+        <w:rPr>
+          <w:rFonts w:ascii="Arial" w:hAnsi="Arial" w:cs="Arial"/>
+          <w:sz w:val="22"/>
+          <w:szCs w:val="22"/>
+          <w:lang w:eastAsia="zh-CN"/>
+        </w:rPr>
+      </w:pPr>
+      <w:r>
+        <w:rPr>
+          <w:rFonts w:ascii="Arial" w:hAnsi="Arial" w:cs="Arial"/>
+          <w:sz w:val="22"/>
+          <w:szCs w:val="22"/>
+          <w:lang w:eastAsia="zh-CN"/>
+        </w:rPr>
+        <w:t>Chapter 3 System Design</w:t>
+      </w:r>
+    </w:p>
+    <w:p>
+      <w:pPr>
+        <w:rPr>
+          <w:rFonts w:ascii="Arial" w:hAnsi="Arial" w:cs="Arial"/>
+          <w:sz w:val="22"/>
+          <w:szCs w:val="22"/>
+          <w:lang w:eastAsia="zh-CN"/>
+        </w:rPr>
+      </w:pPr>
+      <w:r>
+        <w:rPr>
+          <w:rFonts w:ascii="Arial" w:hAnsi="Arial" w:cs="Arial" w:hint="eastAsia"/>
+          <w:sz w:val="22"/>
+          <w:szCs w:val="22"/>
+          <w:lang w:eastAsia="zh-CN"/>
+        </w:rPr>
+        <w:t>•</w:t>
+      </w:r>
+      <w:r>
+        <w:rPr>
+          <w:rFonts w:ascii="Arial" w:hAnsi="Arial" w:cs="Arial"/>
+          <w:sz w:val="22"/>
+          <w:szCs w:val="22"/>
+          <w:lang w:eastAsia="zh-CN"/>
+        </w:rPr>
+        <w:t xml:space="preserve"> Overall Architecture</w:t>
+      </w:r>
+    </w:p>
+    <w:p>
+      <w:pPr>
+        <w:rPr>
+          <w:rFonts w:ascii="Arial" w:hAnsi="Arial" w:cs="Arial"/>
+          <w:sz w:val="22"/>
+          <w:szCs w:val="22"/>
+          <w:lang w:eastAsia="zh-CN"/>
+        </w:rPr>
+      </w:pPr>
+      <w:r>
+        <w:rPr>
+          <w:rFonts w:ascii="Arial" w:hAnsi="Arial" w:cs="Arial" w:hint="eastAsia"/>
+          <w:sz w:val="22"/>
+          <w:szCs w:val="22"/>
+          <w:lang w:eastAsia="zh-CN"/>
+        </w:rPr>
+        <w:t>•</w:t>
+      </w:r>
+      <w:r>
+        <w:rPr>
+          <w:rFonts w:ascii="Arial" w:hAnsi="Arial" w:cs="Arial"/>
+          <w:sz w:val="22"/>
+          <w:szCs w:val="22"/>
+          <w:lang w:eastAsia="zh-CN"/>
+        </w:rPr>
+        <w:t xml:space="preserve"> Model Integration Scheme</w:t>
+      </w:r>
+    </w:p>
+    <w:p>
+      <w:pPr>
+        <w:rPr>
+          <w:rFonts w:ascii="Arial" w:hAnsi="Arial" w:cs="Arial"/>
+          <w:sz w:val="22"/>
+          <w:szCs w:val="22"/>
+          <w:lang w:eastAsia="zh-CN"/>
+        </w:rPr>
+      </w:pPr>
+      <w:r>
+        <w:rPr>
+          <w:rFonts w:ascii="Arial" w:hAnsi="Arial" w:cs="Arial" w:hint="eastAsia"/>
+          <w:sz w:val="22"/>
+          <w:szCs w:val="22"/>
+          <w:lang w:eastAsia="zh-CN"/>
+        </w:rPr>
+        <w:t>•</w:t>
+      </w:r>
+      <w:r>
+        <w:rPr>
+          <w:rFonts w:ascii="Arial" w:hAnsi="Arial" w:cs="Arial"/>
+          <w:sz w:val="22"/>
+          <w:szCs w:val="22"/>
+          <w:lang w:eastAsia="zh-CN"/>
+        </w:rPr>
+        <w:t xml:space="preserve"> UI Design Logic</w:t>
+      </w:r>
+    </w:p>
+    <w:p>
+      <w:pPr>
+        <w:rPr>
+          <w:rFonts w:ascii="Arial" w:hAnsi="Arial" w:cs="Arial"/>
+          <w:sz w:val="22"/>
+          <w:szCs w:val="22"/>
+          <w:lang w:eastAsia="zh-CN"/>
+        </w:rPr>
+      </w:pPr>
+    </w:p>
+    <w:p>
+      <w:pPr>
+        <w:rPr>
+          <w:rFonts w:ascii="Arial" w:hAnsi="Arial" w:cs="Arial"/>
+          <w:sz w:val="22"/>
+          <w:szCs w:val="22"/>
+          <w:lang w:eastAsia="zh-CN"/>
+        </w:rPr>
+      </w:pPr>
+      <w:r>
+        <w:rPr>
+          <w:rFonts w:ascii="Arial" w:hAnsi="Arial" w:cs="Arial"/>
+          <w:sz w:val="22"/>
+          <w:szCs w:val="22"/>
+          <w:lang w:eastAsia="zh-CN"/>
+        </w:rPr>
+        <w:t>Chapter 4 System Implementation</w:t>
+      </w:r>
+    </w:p>
+    <w:p>
+      <w:pPr>
+        <w:rPr>
+          <w:rFonts w:ascii="Arial" w:hAnsi="Arial" w:cs="Arial"/>
+          <w:sz w:val="22"/>
+          <w:szCs w:val="22"/>
+          <w:lang w:eastAsia="zh-CN"/>
+        </w:rPr>
+      </w:pPr>
+      <w:r>
+        <w:rPr>
+          <w:rFonts w:ascii="Arial" w:hAnsi="Arial" w:cs="Arial" w:hint="eastAsia"/>
+          <w:sz w:val="22"/>
+          <w:szCs w:val="22"/>
+          <w:lang w:eastAsia="zh-CN"/>
+        </w:rPr>
+        <w:t>•</w:t>
+      </w:r>
+      <w:r>
+        <w:rPr>
+          <w:rFonts w:ascii="Arial" w:hAnsi="Arial" w:cs="Arial"/>
+          <w:sz w:val="22"/>
+          <w:szCs w:val="22"/>
+          <w:lang w:eastAsia="zh-CN"/>
+        </w:rPr>
+        <w:t xml:space="preserve"> CMake Build Process</w:t>
+      </w:r>
+    </w:p>
+    <w:p>
+      <w:pPr>
+        <w:rPr>
+          <w:rFonts w:ascii="Arial" w:hAnsi="Arial" w:cs="Arial"/>
+          <w:sz w:val="22"/>
+          <w:szCs w:val="22"/>
+          <w:lang w:eastAsia="zh-CN"/>
+        </w:rPr>
+      </w:pPr>
+      <w:r>
+        <w:rPr>
+          <w:rFonts w:ascii="Arial" w:hAnsi="Arial" w:cs="Arial" w:hint="eastAsia"/>
+          <w:sz w:val="22"/>
+          <w:szCs w:val="22"/>
+          <w:lang w:eastAsia="zh-CN"/>
+        </w:rPr>
+        <w:t>•</w:t>
+      </w:r>
+      <w:r>
+        <w:rPr>
+          <w:rFonts w:ascii="Arial" w:hAnsi="Arial" w:cs="Arial"/>
+          <w:sz w:val="22"/>
+          <w:szCs w:val="22"/>
+          <w:lang w:eastAsia="zh-CN"/>
+        </w:rPr>
+        <w:t xml:space="preserve"> Model Loading Mechanism</w:t>
+      </w:r>
+    </w:p>
+    <w:p>
+      <w:pPr>
+        <w:rPr>
+          <w:rFonts w:ascii="Arial" w:hAnsi="Arial" w:cs="Arial"/>
+          <w:sz w:val="22"/>
+          <w:szCs w:val="22"/>
+          <w:lang w:eastAsia="zh-CN"/>
+        </w:rPr>
+      </w:pPr>
+      <w:r>
+        <w:rPr>
+          <w:rFonts w:ascii="Arial" w:hAnsi="Arial" w:cs="Arial" w:hint="eastAsia"/>
+          <w:sz w:val="22"/>
+          <w:szCs w:val="22"/>
+          <w:lang w:eastAsia="zh-CN"/>
+        </w:rPr>
+        <w:t>•</w:t>
+      </w:r>
+      <w:r>
+        <w:rPr>
+          <w:rFonts w:ascii="Arial" w:hAnsi="Arial" w:cs="Arial"/>
+          <w:sz w:val="22"/>
+          <w:szCs w:val="22"/>
+          <w:lang w:eastAsia="zh-CN"/>
+        </w:rPr>
+        <w:t xml:space="preserve"> Parameter Optimization Process</w:t>
+      </w:r>
+    </w:p>
+    <w:p>
+      <w:pPr>
+        <w:rPr>
+          <w:rFonts w:ascii="Arial" w:hAnsi="Arial" w:cs="Arial"/>
+          <w:sz w:val="22"/>
+          <w:szCs w:val="22"/>
+          <w:lang w:eastAsia="zh-CN"/>
+        </w:rPr>
+      </w:pPr>
+      <w:r>
+        <w:rPr>
+          <w:rFonts w:ascii="Arial" w:hAnsi="Arial" w:cs="Arial" w:hint="eastAsia"/>
+          <w:sz w:val="22"/>
+          <w:szCs w:val="22"/>
+          <w:lang w:eastAsia="zh-CN"/>
+        </w:rPr>
+        <w:t>•</w:t>
+      </w:r>
+      <w:r>
+        <w:rPr>
+          <w:rFonts w:ascii="Arial" w:hAnsi="Arial" w:cs="Arial"/>
+          <w:sz w:val="22"/>
+          <w:szCs w:val="22"/>
+          <w:lang w:eastAsia="zh-CN"/>
+        </w:rPr>
+        <w:t xml:space="preserve"> Debugging and Problem Solving</w:t>
+      </w:r>
+    </w:p>
+    <w:p>
+      <w:pPr>
+        <w:rPr>
+          <w:rFonts w:ascii="Arial" w:hAnsi="Arial" w:cs="Arial"/>
+          <w:sz w:val="22"/>
+          <w:szCs w:val="22"/>
+          <w:lang w:eastAsia="zh-CN"/>
+        </w:rPr>
+      </w:pPr>
+    </w:p>
+    <w:p>
+      <w:pPr>
+        <w:rPr>
+          <w:rFonts w:ascii="Arial" w:hAnsi="Arial" w:cs="Arial"/>
+          <w:sz w:val="22"/>
+          <w:szCs w:val="22"/>
+          <w:lang w:eastAsia="zh-CN"/>
+        </w:rPr>
+      </w:pPr>
+      <w:r>
+        <w:rPr>
+          <w:rFonts w:ascii="Arial" w:hAnsi="Arial" w:cs="Arial"/>
+          <w:sz w:val="22"/>
+          <w:szCs w:val="22"/>
+          <w:lang w:eastAsia="zh-CN"/>
+        </w:rPr>
+        <w:t>Chapter 5 Testing and Evaluation</w:t>
+      </w:r>
+    </w:p>
+    <w:p>
+      <w:pPr>
+        <w:rPr>
+          <w:rFonts w:ascii="Arial" w:hAnsi="Arial" w:cs="Arial"/>
+          <w:sz w:val="22"/>
+          <w:szCs w:val="22"/>
+          <w:lang w:eastAsia="zh-CN"/>
+        </w:rPr>
+      </w:pPr>
+      <w:r>
+        <w:rPr>
+          <w:rFonts w:ascii="Arial" w:hAnsi="Arial" w:cs="Arial" w:hint="eastAsia"/>
+          <w:sz w:val="22"/>
+          <w:szCs w:val="22"/>
+          <w:lang w:eastAsia="zh-CN"/>
+        </w:rPr>
+        <w:t>•</w:t>
+      </w:r>
+      <w:r>
+        <w:rPr>
+          <w:rFonts w:ascii="Arial" w:hAnsi="Arial" w:cs="Arial"/>
+          <w:sz w:val="22"/>
+          <w:szCs w:val="22"/>
+          <w:lang w:eastAsia="zh-CN"/>
+        </w:rPr>
+        <w:t xml:space="preserve"> Performance Testing</w:t>
+      </w:r>
+    </w:p>
+    <w:p>
+      <w:pPr>
+        <w:rPr>
+          <w:rFonts w:ascii="Arial" w:hAnsi="Arial" w:cs="Arial"/>
+          <w:sz w:val="22"/>
+          <w:szCs w:val="22"/>
+          <w:lang w:eastAsia="zh-CN"/>
+        </w:rPr>
+      </w:pPr>
+      <w:r>
+        <w:rPr>
+          <w:rFonts w:ascii="Arial" w:hAnsi="Arial" w:cs="Arial" w:hint="eastAsia"/>
+          <w:sz w:val="22"/>
+          <w:szCs w:val="22"/>
+          <w:lang w:eastAsia="zh-CN"/>
+        </w:rPr>
+        <w:t>•</w:t>
+      </w:r>
+      <w:r>
+        <w:rPr>
+          <w:rFonts w:ascii="Arial" w:hAnsi="Arial" w:cs="Arial"/>
+          <w:sz w:val="22"/>
+          <w:szCs w:val="22"/>
+          <w:lang w:eastAsia="zh-CN"/>
+        </w:rPr>
+        <w:t xml:space="preserve"> Accuracy Testing</w:t>
+      </w:r>
+    </w:p>
+    <w:p>
+      <w:pPr>
+        <w:rPr>
+          <w:rFonts w:ascii="Arial" w:hAnsi="Arial" w:cs="Arial"/>
+          <w:sz w:val="22"/>
+          <w:szCs w:val="22"/>
+          <w:lang w:eastAsia="zh-CN"/>
+        </w:rPr>
+      </w:pPr>
+      <w:r>
+        <w:rPr>
+          <w:rFonts w:ascii="Arial" w:hAnsi="Arial" w:cs="Arial" w:hint="eastAsia"/>
+          <w:sz w:val="22"/>
+          <w:szCs w:val="22"/>
+          <w:lang w:eastAsia="zh-CN"/>
+        </w:rPr>
+        <w:t>•</w:t>
+      </w:r>
+      <w:r>
+        <w:rPr>
+          <w:rFonts w:ascii="Arial" w:hAnsi="Arial" w:cs="Arial"/>
+          <w:sz w:val="22"/>
+          <w:szCs w:val="22"/>
+          <w:lang w:eastAsia="zh-CN"/>
+        </w:rPr>
+        <w:t xml:space="preserve"> User Feedback Analysis</w:t>
+      </w:r>
+    </w:p>
+    <w:p>
+      <w:pPr>
+        <w:rPr>
+          <w:rFonts w:ascii="Arial" w:hAnsi="Arial" w:cs="Arial"/>
+          <w:sz w:val="22"/>
+          <w:szCs w:val="22"/>
+          <w:lang w:eastAsia="zh-CN"/>
+        </w:rPr>
+      </w:pPr>
+    </w:p>
+    <w:p>
+      <w:pPr>
+        <w:rPr>
+          <w:rFonts w:ascii="Arial" w:hAnsi="Arial" w:cs="Arial"/>
+          <w:sz w:val="22"/>
+          <w:szCs w:val="22"/>
+          <w:lang w:eastAsia="zh-CN"/>
+        </w:rPr>
+      </w:pPr>
+      <w:r>
+        <w:rPr>
+          <w:rFonts w:ascii="Arial" w:hAnsi="Arial" w:cs="Arial"/>
+          <w:sz w:val="22"/>
+          <w:szCs w:val="22"/>
+          <w:lang w:eastAsia="zh-CN"/>
+        </w:rPr>
+        <w:lastRenderedPageBreak/>
+        <w:t>Chapter 6 Discussion</w:t>
+      </w:r>
+    </w:p>
+    <w:p>
+      <w:pPr>
+        <w:rPr>
+          <w:rFonts w:ascii="Arial" w:hAnsi="Arial" w:cs="Arial"/>
+          <w:sz w:val="22"/>
+          <w:szCs w:val="22"/>
+          <w:lang w:eastAsia="zh-CN"/>
+        </w:rPr>
+      </w:pPr>
+      <w:r>
+        <w:rPr>
+          <w:rFonts w:ascii="Arial" w:hAnsi="Arial" w:cs="Arial" w:hint="eastAsia"/>
+          <w:sz w:val="22"/>
+          <w:szCs w:val="22"/>
+          <w:lang w:eastAsia="zh-CN"/>
+        </w:rPr>
+        <w:t>•</w:t>
+      </w:r>
+      <w:r>
+        <w:rPr>
+          <w:rFonts w:ascii="Arial" w:hAnsi="Arial" w:cs="Arial"/>
+          <w:sz w:val="22"/>
+          <w:szCs w:val="22"/>
+          <w:lang w:eastAsia="zh-CN"/>
+        </w:rPr>
+        <w:t xml:space="preserve"> Technical Significance</w:t>
+      </w:r>
+    </w:p>
+    <w:p>
+      <w:pPr>
+        <w:rPr>
+          <w:rFonts w:ascii="Arial" w:hAnsi="Arial" w:cs="Arial"/>
+          <w:sz w:val="22"/>
+          <w:szCs w:val="22"/>
+          <w:lang w:eastAsia="zh-CN"/>
+        </w:rPr>
+      </w:pPr>
+      <w:r>
+        <w:rPr>
+          <w:rFonts w:ascii="Arial" w:hAnsi="Arial" w:cs="Arial" w:hint="eastAsia"/>
+          <w:sz w:val="22"/>
+          <w:szCs w:val="22"/>
+          <w:lang w:eastAsia="zh-CN"/>
+        </w:rPr>
+        <w:t>•</w:t>
+      </w:r>
+      <w:r>
+        <w:rPr>
+          <w:rFonts w:ascii="Arial" w:hAnsi="Arial" w:cs="Arial"/>
+          <w:sz w:val="22"/>
+          <w:szCs w:val="22"/>
+          <w:lang w:eastAsia="zh-CN"/>
+        </w:rPr>
+        <w:t xml:space="preserve"> Educational Application Value</w:t>
+      </w:r>
+    </w:p>
+    <w:p>
+      <w:pPr>
+        <w:rPr>
+          <w:rFonts w:ascii="Arial" w:hAnsi="Arial" w:cs="Arial"/>
+          <w:sz w:val="22"/>
+          <w:szCs w:val="22"/>
+          <w:lang w:eastAsia="zh-CN"/>
+        </w:rPr>
+      </w:pPr>
+      <w:r>
+        <w:rPr>
+          <w:rFonts w:ascii="Arial" w:hAnsi="Arial" w:cs="Arial" w:hint="eastAsia"/>
+          <w:sz w:val="22"/>
+          <w:szCs w:val="22"/>
+          <w:lang w:eastAsia="zh-CN"/>
+        </w:rPr>
+        <w:t>•</w:t>
+      </w:r>
+      <w:r>
+        <w:rPr>
+          <w:rFonts w:ascii="Arial" w:hAnsi="Arial" w:cs="Arial"/>
+          <w:sz w:val="22"/>
+          <w:szCs w:val="22"/>
+          <w:lang w:eastAsia="zh-CN"/>
+        </w:rPr>
+        <w:t xml:space="preserve"> Limitations</w:t>
+      </w:r>
+    </w:p>
+    <w:p>
+      <w:pPr>
+        <w:rPr>
+          <w:rFonts w:ascii="Arial" w:hAnsi="Arial" w:cs="Arial"/>
+          <w:sz w:val="22"/>
+          <w:szCs w:val="22"/>
+          <w:lang w:eastAsia="zh-CN"/>
+        </w:rPr>
+      </w:pPr>
+    </w:p>
+    <w:p>
+      <w:pPr>
+        <w:rPr>
+          <w:rFonts w:ascii="Arial" w:hAnsi="Arial" w:cs="Arial"/>
+          <w:sz w:val="22"/>
+          <w:szCs w:val="22"/>
+          <w:lang w:eastAsia="zh-CN"/>
+        </w:rPr>
+      </w:pPr>
+      <w:r>
+        <w:rPr>
+          <w:rFonts w:ascii="Arial" w:hAnsi="Arial" w:cs="Arial"/>
+          <w:sz w:val="22"/>
+          <w:szCs w:val="22"/>
+          <w:lang w:eastAsia="zh-CN"/>
+        </w:rPr>
+        <w:t>Chapter 7 Conclusion and Future Prospects</w:t>
       </w:r>
     </w:p>
     <w:sectPr>
-      <w:headerReference w:type="default" r:id="rId7"/>
+      <w:headerReference w:type="default" r:id="rId11"/>
       <w:type w:val="continuous"/>
       <w:pgSz w:w="11910" w:h="16840"/>
       <w:pgMar w:top="2365" w:right="1361" w:bottom="1361" w:left="1361" w:header="992" w:footer="987" w:gutter="567"/>
@@ -5512,6 +6831,59 @@
       </w:tcPr>
     </w:tblStylePr>
   </w:style>
+  <w:style w:type="paragraph" w:styleId="af2">
+    <w:name w:val="footnote text"/>
+    <w:basedOn w:val="a"/>
+    <w:link w:val="af3"/>
+    <w:uiPriority w:val="99"/>
+    <w:semiHidden/>
+    <w:unhideWhenUsed/>
+    <w:rsid w:val="00F43CAB"/>
+    <w:pPr>
+      <w:snapToGrid w:val="0"/>
+    </w:pPr>
+    <w:rPr>
+      <w:sz w:val="18"/>
+      <w:szCs w:val="18"/>
+    </w:rPr>
+  </w:style>
+  <w:style w:type="character" w:customStyle="1" w:styleId="af3">
+    <w:name w:val="脚注文本 字符"/>
+    <w:basedOn w:val="a0"/>
+    <w:link w:val="af2"/>
+    <w:uiPriority w:val="99"/>
+    <w:semiHidden/>
+    <w:rsid w:val="00F43CAB"/>
+    <w:rPr>
+      <w:sz w:val="18"/>
+      <w:szCs w:val="18"/>
+    </w:rPr>
+  </w:style>
+  <w:style w:type="character" w:styleId="af4">
+    <w:name w:val="footnote reference"/>
+    <w:basedOn w:val="a0"/>
+    <w:uiPriority w:val="99"/>
+    <w:semiHidden/>
+    <w:unhideWhenUsed/>
+    <w:rsid w:val="00F43CAB"/>
+    <w:rPr>
+      <w:vertAlign w:val="superscript"/>
+    </w:rPr>
+  </w:style>
+  <w:style w:type="paragraph" w:styleId="af5">
+    <w:name w:val="caption"/>
+    <w:basedOn w:val="a"/>
+    <w:next w:val="a"/>
+    <w:uiPriority w:val="35"/>
+    <w:unhideWhenUsed/>
+    <w:qFormat/>
+    <w:rsid w:val="00F43CAB"/>
+    <w:rPr>
+      <w:rFonts w:asciiTheme="majorHAnsi" w:eastAsia="黑体" w:hAnsiTheme="majorHAnsi" w:cstheme="majorBidi"/>
+      <w:sz w:val="20"/>
+      <w:szCs w:val="20"/>
+    </w:rPr>
+  </w:style>
 </w:styles>
 </file>
 
@@ -5828,4 +7200,16 @@
     </a:ext>
   </a:extLst>
 </a:theme>
+</file>
+
+<file path=customXml/item1.xml><?xml version="1.0" encoding="utf-8"?>
+<b:Sources xmlns:b="http://schemas.openxmlformats.org/officeDocument/2006/bibliography" xmlns="http://schemas.openxmlformats.org/officeDocument/2006/bibliography" SelectedStyle="\HarvardAnglia2008OfficeOnline.xsl" StyleName="Harvard - Anglia" Version="2008"/>
+</file>
+
+<file path=customXml/itemProps1.xml><?xml version="1.0" encoding="utf-8"?>
+<ds:datastoreItem xmlns:ds="http://schemas.openxmlformats.org/officeDocument/2006/customXml" ds:itemID="{74BE6D31-DAD0-4430-AD2B-B40CBC7F4A74}">
+  <ds:schemaRefs>
+    <ds:schemaRef ds:uri="http://schemas.openxmlformats.org/officeDocument/2006/bibliography"/>
+  </ds:schemaRefs>
+</ds:datastoreItem>
 </file>
</xml_diff>